<commit_message>
Customizations using sx prop
</commit_message>
<xml_diff>
--- a/Notes.docx
+++ b/Notes.docx
@@ -25,48 +25,674 @@
       </w:r>
     </w:p>
     <w:p/>
+    <w:sdt>
+      <w:sdtPr>
+        <w:rPr>
+          <w:rFonts w:ascii="Times New Roman" w:eastAsiaTheme="minorHAnsi" w:hAnsi="Times New Roman" w:cstheme="minorBidi"/>
+          <w:color w:val="auto"/>
+          <w:kern w:val="2"/>
+          <w:sz w:val="24"/>
+          <w:szCs w:val="22"/>
+          <w:lang w:val="en-IN"/>
+          <w14:ligatures w14:val="standardContextual"/>
+        </w:rPr>
+        <w:id w:val="822552962"/>
+        <w:docPartObj>
+          <w:docPartGallery w:val="Table of Contents"/>
+          <w:docPartUnique/>
+        </w:docPartObj>
+      </w:sdtPr>
+      <w:sdtEndPr>
+        <w:rPr>
+          <w:b/>
+          <w:bCs/>
+          <w:noProof/>
+        </w:rPr>
+      </w:sdtEndPr>
+      <w:sdtContent>
+        <w:p>
+          <w:pPr>
+            <w:pStyle w:val="TOCHeading"/>
+          </w:pPr>
+          <w:r>
+            <w:t>Contents</w:t>
+          </w:r>
+        </w:p>
+        <w:p>
+          <w:pPr>
+            <w:pStyle w:val="TOC1"/>
+            <w:tabs>
+              <w:tab w:val="right" w:leader="dot" w:pos="9016"/>
+            </w:tabs>
+            <w:rPr>
+              <w:rFonts w:asciiTheme="minorHAnsi" w:eastAsiaTheme="minorEastAsia" w:hAnsiTheme="minorHAnsi"/>
+              <w:noProof/>
+              <w:szCs w:val="24"/>
+              <w:lang w:eastAsia="en-IN" w:bidi="gu-IN"/>
+            </w:rPr>
+          </w:pPr>
+          <w:r>
+            <w:fldChar w:fldCharType="begin"/>
+          </w:r>
+          <w:r>
+            <w:instrText xml:space="preserve"> TOC \o "1-3" \h \z \u </w:instrText>
+          </w:r>
+          <w:r>
+            <w:fldChar w:fldCharType="separate"/>
+          </w:r>
+          <w:hyperlink w:anchor="_Toc228962401" w:history="1">
+            <w:r>
+              <w:rPr>
+                <w:rStyle w:val="Hyperlink"/>
+                <w:noProof/>
+              </w:rPr>
+              <w:t>Components:</w:t>
+            </w:r>
+            <w:r>
+              <w:rPr>
+                <w:noProof/>
+                <w:webHidden/>
+              </w:rPr>
+              <w:tab/>
+            </w:r>
+            <w:r>
+              <w:rPr>
+                <w:noProof/>
+                <w:webHidden/>
+              </w:rPr>
+              <w:fldChar w:fldCharType="begin"/>
+            </w:r>
+            <w:r>
+              <w:rPr>
+                <w:noProof/>
+                <w:webHidden/>
+              </w:rPr>
+              <w:instrText xml:space="preserve"> PAGEREF _Toc228962401 \h </w:instrText>
+            </w:r>
+            <w:r>
+              <w:rPr>
+                <w:noProof/>
+                <w:webHidden/>
+              </w:rPr>
+            </w:r>
+            <w:r>
+              <w:rPr>
+                <w:noProof/>
+                <w:webHidden/>
+              </w:rPr>
+              <w:fldChar w:fldCharType="separate"/>
+            </w:r>
+            <w:r>
+              <w:rPr>
+                <w:noProof/>
+                <w:webHidden/>
+              </w:rPr>
+              <w:t>2</w:t>
+            </w:r>
+            <w:r>
+              <w:rPr>
+                <w:noProof/>
+                <w:webHidden/>
+              </w:rPr>
+              <w:fldChar w:fldCharType="end"/>
+            </w:r>
+          </w:hyperlink>
+        </w:p>
+        <w:p>
+          <w:pPr>
+            <w:pStyle w:val="TOC1"/>
+            <w:tabs>
+              <w:tab w:val="right" w:leader="dot" w:pos="9016"/>
+            </w:tabs>
+            <w:rPr>
+              <w:rFonts w:asciiTheme="minorHAnsi" w:eastAsiaTheme="minorEastAsia" w:hAnsiTheme="minorHAnsi"/>
+              <w:noProof/>
+              <w:szCs w:val="24"/>
+              <w:lang w:eastAsia="en-IN" w:bidi="gu-IN"/>
+            </w:rPr>
+          </w:pPr>
+          <w:hyperlink w:anchor="_Toc228962402" w:history="1">
+            <w:r>
+              <w:rPr>
+                <w:rStyle w:val="Hyperlink"/>
+                <w:noProof/>
+              </w:rPr>
+              <w:t>Icons:</w:t>
+            </w:r>
+            <w:r>
+              <w:rPr>
+                <w:noProof/>
+                <w:webHidden/>
+              </w:rPr>
+              <w:tab/>
+            </w:r>
+            <w:r>
+              <w:rPr>
+                <w:noProof/>
+                <w:webHidden/>
+              </w:rPr>
+              <w:fldChar w:fldCharType="begin"/>
+            </w:r>
+            <w:r>
+              <w:rPr>
+                <w:noProof/>
+                <w:webHidden/>
+              </w:rPr>
+              <w:instrText xml:space="preserve"> PAGEREF _Toc228962402 \h </w:instrText>
+            </w:r>
+            <w:r>
+              <w:rPr>
+                <w:noProof/>
+                <w:webHidden/>
+              </w:rPr>
+            </w:r>
+            <w:r>
+              <w:rPr>
+                <w:noProof/>
+                <w:webHidden/>
+              </w:rPr>
+              <w:fldChar w:fldCharType="separate"/>
+            </w:r>
+            <w:r>
+              <w:rPr>
+                <w:noProof/>
+                <w:webHidden/>
+              </w:rPr>
+              <w:t>2</w:t>
+            </w:r>
+            <w:r>
+              <w:rPr>
+                <w:noProof/>
+                <w:webHidden/>
+              </w:rPr>
+              <w:fldChar w:fldCharType="end"/>
+            </w:r>
+          </w:hyperlink>
+        </w:p>
+        <w:p>
+          <w:pPr>
+            <w:pStyle w:val="TOC1"/>
+            <w:tabs>
+              <w:tab w:val="right" w:leader="dot" w:pos="9016"/>
+            </w:tabs>
+            <w:rPr>
+              <w:rFonts w:asciiTheme="minorHAnsi" w:eastAsiaTheme="minorEastAsia" w:hAnsiTheme="minorHAnsi"/>
+              <w:noProof/>
+              <w:szCs w:val="24"/>
+              <w:lang w:eastAsia="en-IN" w:bidi="gu-IN"/>
+            </w:rPr>
+          </w:pPr>
+          <w:hyperlink w:anchor="_Toc228962403" w:history="1">
+            <w:r>
+              <w:rPr>
+                <w:rStyle w:val="Hyperlink"/>
+                <w:noProof/>
+              </w:rPr>
+              <w:t>Customizing with s</w:t>
+            </w:r>
+            <w:r>
+              <w:rPr>
+                <w:rStyle w:val="Hyperlink"/>
+                <w:noProof/>
+              </w:rPr>
+              <w:t>x</w:t>
+            </w:r>
+            <w:r>
+              <w:rPr>
+                <w:rStyle w:val="Hyperlink"/>
+                <w:noProof/>
+              </w:rPr>
+              <w:t>={{}}</w:t>
+            </w:r>
+            <w:r>
+              <w:rPr>
+                <w:noProof/>
+                <w:webHidden/>
+              </w:rPr>
+              <w:tab/>
+            </w:r>
+            <w:r>
+              <w:rPr>
+                <w:noProof/>
+                <w:webHidden/>
+              </w:rPr>
+              <w:fldChar w:fldCharType="begin"/>
+            </w:r>
+            <w:r>
+              <w:rPr>
+                <w:noProof/>
+                <w:webHidden/>
+              </w:rPr>
+              <w:instrText xml:space="preserve"> PAGEREF _Toc228962403 \h </w:instrText>
+            </w:r>
+            <w:r>
+              <w:rPr>
+                <w:noProof/>
+                <w:webHidden/>
+              </w:rPr>
+            </w:r>
+            <w:r>
+              <w:rPr>
+                <w:noProof/>
+                <w:webHidden/>
+              </w:rPr>
+              <w:fldChar w:fldCharType="separate"/>
+            </w:r>
+            <w:r>
+              <w:rPr>
+                <w:noProof/>
+                <w:webHidden/>
+              </w:rPr>
+              <w:t>2</w:t>
+            </w:r>
+            <w:r>
+              <w:rPr>
+                <w:noProof/>
+                <w:webHidden/>
+              </w:rPr>
+              <w:fldChar w:fldCharType="end"/>
+            </w:r>
+          </w:hyperlink>
+        </w:p>
+        <w:p>
+          <w:r>
+            <w:rPr>
+              <w:b/>
+              <w:bCs/>
+              <w:noProof/>
+            </w:rPr>
+            <w:fldChar w:fldCharType="end"/>
+          </w:r>
+        </w:p>
+      </w:sdtContent>
+    </w:sdt>
+    <w:p>
+      <w:r>
+        <w:br w:type="page"/>
+      </w:r>
+    </w:p>
+    <w:p/>
     <w:p>
       <w:r>
         <w:t>1 MUI Unit = 8px</w:t>
       </w:r>
     </w:p>
+    <w:p>
+      <w:pPr>
+        <w:pStyle w:val="Heading1"/>
+      </w:pPr>
+      <w:bookmarkStart w:id="0" w:name="_Toc228962401"/>
+      <w:r>
+        <w:t>Components:</w:t>
+      </w:r>
+      <w:bookmarkEnd w:id="0"/>
+    </w:p>
+    <w:p>
+      <w:r>
+        <w:t>We have different components in MUI</w:t>
+      </w:r>
+    </w:p>
+    <w:p>
+      <w:r>
+        <w:t>E.g.</w:t>
+      </w:r>
+    </w:p>
+    <w:p>
+      <w:r>
+        <w:t xml:space="preserve">&lt;Container&gt;&lt;/Container&gt; </w:t>
+      </w:r>
+      <w:r>
+        <w:sym w:font="Wingdings" w:char="F0E0"/>
+      </w:r>
+      <w:r>
+        <w:t xml:space="preserve"> To make it Every thing in center</w:t>
+      </w:r>
+    </w:p>
+    <w:p>
+      <w:r>
+        <w:t xml:space="preserve">&lt;Stack&gt;&lt;/Stack&gt; </w:t>
+      </w:r>
+    </w:p>
+    <w:p>
+      <w:r>
+        <w:t>&lt;TextField /&gt;</w:t>
+      </w:r>
+    </w:p>
+    <w:p>
+      <w:r>
+        <w:t>&lt;Slider /&gt;</w:t>
+      </w:r>
+    </w:p>
+    <w:p>
+      <w:r>
+        <w:t xml:space="preserve">&lt;Button&gt;&lt;/Button&gt; </w:t>
+      </w:r>
+    </w:p>
     <w:p/>
     <w:p>
       <w:r>
+        <w:t>Etc…….</w:t>
+      </w:r>
+    </w:p>
+    <w:p/>
+    <w:p/>
+    <w:p>
+      <w:pPr>
+        <w:pStyle w:val="Heading1"/>
+      </w:pPr>
+      <w:bookmarkStart w:id="1" w:name="_Toc228962402"/>
+      <w:r>
+        <w:t>Icons:</w:t>
+      </w:r>
+      <w:bookmarkEnd w:id="1"/>
+    </w:p>
+    <w:p>
+      <w:r>
+        <w:t>In MUI, we can access and search and get desired icon by going</w:t>
+      </w:r>
+    </w:p>
+    <w:p>
+      <w:r>
+        <w:t>Docs &gt; All components &gt; Data Display &gt; Material Icons</w:t>
+      </w:r>
+    </w:p>
+    <w:p>
+      <w:r>
+        <w:t>And can search it and copy it!</w:t>
+      </w:r>
+    </w:p>
+    <w:p/>
+    <w:p>
+      <w:r>
         <w:t xml:space="preserve">We can have &lt;Button </w:t>
       </w:r>
-      <w:proofErr w:type="spellStart"/>
       <w:r>
         <w:rPr>
           <w:color w:val="ED7D31" w:themeColor="accent2"/>
         </w:rPr>
-        <w:t>startIcon</w:t>
-      </w:r>
-      <w:proofErr w:type="spellEnd"/>
-      <w:r>
+        <w:t>startIcon={&lt;SomeIcon/&gt;</w:t>
+      </w:r>
+      <w:r>
+        <w:t>}&gt; &lt;/Button&gt;</w:t>
+      </w:r>
+    </w:p>
+    <w:p/>
+    <w:p/>
+    <w:p>
+      <w:pPr>
+        <w:pStyle w:val="Heading1"/>
+      </w:pPr>
+      <w:bookmarkStart w:id="2" w:name="_Toc228962403"/>
+      <w:r>
+        <w:t>Customizing with sx</w:t>
+      </w:r>
+      <w:proofErr w:type="gramStart"/>
+      <w:r>
+        <w:t>={</w:t>
+      </w:r>
+      <w:proofErr w:type="gramEnd"/>
+      <w:r>
+        <w:t>{}}</w:t>
+      </w:r>
+      <w:bookmarkEnd w:id="2"/>
+    </w:p>
+    <w:p/>
+    <w:p>
+      <w:r>
+        <w:t>You can check default global object of colours defined in</w:t>
+      </w:r>
+    </w:p>
+    <w:p>
+      <w:r>
+        <w:t>Customization &gt; Theme &gt; Default Theme Viewer</w:t>
+      </w:r>
+    </w:p>
+    <w:p/>
+    <w:p>
+      <w:pPr>
+        <w:pStyle w:val="ListParagraph"/>
+        <w:numPr>
+          <w:ilvl w:val="0"/>
+          <w:numId w:val="1"/>
+        </w:numPr>
+      </w:pPr>
+      <w:r>
+        <w:t xml:space="preserve">We can define </w:t>
+      </w:r>
+      <w:proofErr w:type="gramStart"/>
+      <w:r>
+        <w:t>“:hover”:{</w:t>
+      </w:r>
+      <w:proofErr w:type="gramEnd"/>
+      <w:r>
+        <w:t>color</w:t>
+      </w:r>
+      <w:proofErr w:type="gramStart"/>
+      <w:r>
+        <w:t>:”red</w:t>
+      </w:r>
+      <w:proofErr w:type="gramEnd"/>
+      <w:r>
+        <w:t>”}</w:t>
+      </w:r>
+    </w:p>
+    <w:p>
+      <w:pPr>
+        <w:pStyle w:val="ListParagraph"/>
+        <w:numPr>
+          <w:ilvl w:val="0"/>
+          <w:numId w:val="1"/>
+        </w:numPr>
+      </w:pPr>
+      <w:r>
+        <w:t xml:space="preserve">And We can also style the child </w:t>
+      </w:r>
+      <w:r>
+        <w:t>C</w:t>
+      </w:r>
+      <w:r>
+        <w:t xml:space="preserve">omponent </w:t>
+      </w:r>
+      <w:r>
+        <w:t>like this:</w:t>
+      </w:r>
+    </w:p>
+    <w:p>
+      <w:pPr>
+        <w:ind w:left="720"/>
+      </w:pPr>
+      <w:r>
+        <w:t xml:space="preserve">sx </w:t>
+      </w:r>
+      <w:proofErr w:type="gramStart"/>
+      <w:r>
+        <w:t>={{ “&amp; .MuiSlider</w:t>
+      </w:r>
+      <w:proofErr w:type="gramEnd"/>
+      <w:r>
+        <w:t>-thumb</w:t>
+      </w:r>
+      <w:proofErr w:type="gramStart"/>
+      <w:r>
+        <w:t>” :</w:t>
+      </w:r>
+      <w:proofErr w:type="gramEnd"/>
+      <w:r>
+        <w:t xml:space="preserve"> </w:t>
+      </w:r>
+      <w:proofErr w:type="gramStart"/>
+      <w:r>
+        <w:t>{ color</w:t>
+      </w:r>
+      <w:proofErr w:type="gramEnd"/>
+      <w:r>
+        <w:t>: “blue”}}}</w:t>
+      </w:r>
+    </w:p>
+    <w:p>
+      <w:pPr>
+        <w:ind w:left="720"/>
+      </w:pPr>
+      <w:r>
+        <w:lastRenderedPageBreak/>
+        <w:t xml:space="preserve">where &amp; means </w:t>
+      </w:r>
+      <w:r>
+        <w:sym w:font="Wingdings" w:char="F0E0"/>
+      </w:r>
+      <w:r>
+        <w:t xml:space="preserve"> we are </w:t>
+      </w:r>
+      <w:r>
+        <w:t>referring</w:t>
+      </w:r>
+      <w:r>
+        <w:t xml:space="preserve"> </w:t>
+      </w:r>
+      <w:proofErr w:type="gramStart"/>
+      <w:r>
+        <w:t>it’s</w:t>
+      </w:r>
+      <w:proofErr w:type="gramEnd"/>
+      <w:r>
+        <w:t xml:space="preserve"> parent means whichever the component we are writing </w:t>
+      </w:r>
+      <w:proofErr w:type="gramStart"/>
+      <w:r>
+        <w:t>it’s</w:t>
+      </w:r>
+      <w:proofErr w:type="gramEnd"/>
+      <w:r>
+        <w:t xml:space="preserve"> Parent </w:t>
+      </w:r>
+    </w:p>
+    <w:p>
+      <w:pPr>
+        <w:ind w:left="720"/>
+      </w:pPr>
+    </w:p>
+    <w:p>
+      <w:pPr>
+        <w:ind w:left="720"/>
+      </w:pPr>
+      <w:r>
+        <w:t>it’s like writing in CSS</w:t>
+      </w:r>
+    </w:p>
+    <w:p>
+      <w:pPr>
+        <w:ind w:left="720"/>
+      </w:pPr>
+    </w:p>
+    <w:p>
+      <w:pPr>
+        <w:ind w:left="720"/>
+      </w:pPr>
+      <w:proofErr w:type="gramStart"/>
+      <w:r>
+        <w:t>.MuiSlider</w:t>
+      </w:r>
+      <w:proofErr w:type="gramEnd"/>
+      <w:r>
+        <w:t>-</w:t>
+      </w:r>
+      <w:proofErr w:type="gramStart"/>
+      <w:r>
+        <w:t>root .MuiSlider</w:t>
+      </w:r>
+      <w:proofErr w:type="gramEnd"/>
+      <w:r>
+        <w:t>-</w:t>
+      </w:r>
+      <w:proofErr w:type="gramStart"/>
+      <w:r>
+        <w:t>thumb</w:t>
+      </w:r>
+      <w:r>
+        <w:t xml:space="preserve"> :</w:t>
+      </w:r>
+      <w:proofErr w:type="gramEnd"/>
+      <w:r>
+        <w:t xml:space="preserve"> {}</w:t>
+      </w:r>
+    </w:p>
+    <w:p>
+      <w:pPr>
+        <w:ind w:left="720"/>
+      </w:pPr>
+    </w:p>
+    <w:p>
+      <w:pPr>
+        <w:ind w:left="720"/>
+      </w:pPr>
+      <w:proofErr w:type="gramStart"/>
+      <w:r>
+        <w:t>So</w:t>
+      </w:r>
+      <w:proofErr w:type="gramEnd"/>
+      <w:r>
+        <w:t xml:space="preserve"> in here we are </w:t>
+      </w:r>
+      <w:proofErr w:type="gramStart"/>
+      <w:r>
+        <w:t>referring .MuiSlider</w:t>
+      </w:r>
+      <w:proofErr w:type="gramEnd"/>
+      <w:r>
+        <w:t>-root by “&amp;”</w:t>
+      </w:r>
+    </w:p>
+    <w:p>
+      <w:pPr>
+        <w:ind w:left="720"/>
+      </w:pPr>
+    </w:p>
+    <w:p>
+      <w:pPr>
+        <w:ind w:left="720"/>
+      </w:pPr>
+    </w:p>
+    <w:p>
+      <w:r>
+        <w:t xml:space="preserve">- We know some states are there like </w:t>
+      </w:r>
+      <w:proofErr w:type="gramStart"/>
+      <w:r>
+        <w:t>“:hover</w:t>
+      </w:r>
+      <w:proofErr w:type="gramEnd"/>
+      <w:r>
+        <w:t>” and other that browser know</w:t>
+      </w:r>
+    </w:p>
+    <w:p>
+      <w:pPr>
         <w:rPr>
-          <w:color w:val="ED7D31" w:themeColor="accent2"/>
+          <w:b/>
+          <w:bCs/>
         </w:rPr>
-        <w:t>={&lt;</w:t>
-      </w:r>
-      <w:proofErr w:type="spellStart"/>
+      </w:pPr>
+      <w:r>
+        <w:t xml:space="preserve">- </w:t>
+      </w:r>
+      <w:r>
+        <w:t>but there are some states that browser doesn’t know abou</w:t>
+      </w:r>
+      <w:r>
+        <w:t xml:space="preserve">t, </w:t>
+      </w:r>
+      <w:r>
+        <w:t xml:space="preserve">those are custom state classes – You can check them </w:t>
+      </w:r>
       <w:r>
         <w:rPr>
-          <w:color w:val="ED7D31" w:themeColor="accent2"/>
+          <w:b/>
+          <w:bCs/>
         </w:rPr>
-        <w:t>SomeIcon</w:t>
-      </w:r>
-      <w:proofErr w:type="spellEnd"/>
-      <w:r>
-        <w:rPr>
-          <w:color w:val="ED7D31" w:themeColor="accent2"/>
-        </w:rPr>
-        <w:t>/&gt;</w:t>
-      </w:r>
-      <w:r>
-        <w:t>}&gt; &lt;/Button&gt;</w:t>
-      </w:r>
-    </w:p>
+        <w:t>in Customization &gt; How to Customize &gt; What custom state classes are available in Material UI?</w:t>
+      </w:r>
+    </w:p>
+    <w:p/>
     <w:sectPr>
       <w:pgSz w:w="11906" w:h="16838"/>
       <w:pgMar w:top="1440" w:right="1440" w:bottom="1440" w:left="1440" w:header="708" w:footer="708" w:gutter="0"/>
@@ -75,6 +701,127 @@
     </w:sectPr>
   </w:body>
 </w:document>
+</file>
+
+<file path=word/numbering.xml><?xml version="1.0" encoding="utf-8"?>
+<w:numbering xmlns:wpc="http://schemas.microsoft.com/office/word/2010/wordprocessingCanvas" xmlns:cx="http://schemas.microsoft.com/office/drawing/2014/chartex" xmlns:cx1="http://schemas.microsoft.com/office/drawing/2015/9/8/chartex" xmlns:cx2="http://schemas.microsoft.com/office/drawing/2015/10/21/chartex" xmlns:cx3="http://schemas.microsoft.com/office/drawing/2016/5/9/chartex" xmlns:cx4="http://schemas.microsoft.com/office/drawing/2016/5/10/chartex" xmlns:cx5="http://schemas.microsoft.com/office/drawing/2016/5/11/chartex" xmlns:cx6="http://schemas.microsoft.com/office/drawing/2016/5/12/chartex" xmlns:cx7="http://schemas.microsoft.com/office/drawing/2016/5/13/chartex" xmlns:cx8="http://schemas.microsoft.com/office/drawing/2016/5/14/chartex" xmlns:mc="http://schemas.openxmlformats.org/markup-compatibility/2006" xmlns:aink="http://schemas.microsoft.com/office/drawing/2016/ink" xmlns:am3d="http://schemas.microsoft.com/office/drawing/2017/model3d" xmlns:o="urn:schemas-microsoft-com:office:office" xmlns:oel="http://schemas.microsoft.com/office/2019/extlst" xmlns:r="http://schemas.openxmlformats.org/officeDocument/2006/relationships" xmlns:m="http://schemas.openxmlformats.org/officeDocument/2006/math" xmlns:v="urn:schemas-microsoft-com:vml" xmlns:wp14="http://schemas.microsoft.com/office/word/2010/wordprocessingDrawing" xmlns:wp="http://schemas.openxmlformats.org/drawingml/2006/wordprocessingDrawing" xmlns:w10="urn:schemas-microsoft-com:office:word" xmlns:w="http://schemas.openxmlformats.org/wordprocessingml/2006/main" xmlns:w14="http://schemas.microsoft.com/office/word/2010/wordml" xmlns:w15="http://schemas.microsoft.com/office/word/2012/wordml" xmlns:w16cex="http://schemas.microsoft.com/office/word/2018/wordml/cex" xmlns:w16cid="http://schemas.microsoft.com/office/word/2016/wordml/cid" xmlns:w16="http://schemas.microsoft.com/office/word/2018/wordml" xmlns:w16du="http://schemas.microsoft.com/office/word/2023/wordml/word16du" xmlns:w16sdtdh="http://schemas.microsoft.com/office/word/2020/wordml/sdtdatahash" xmlns:w16sdtfl="http://schemas.microsoft.com/office/word/2024/wordml/sdtformatlock" xmlns:w16se="http://schemas.microsoft.com/office/word/2015/wordml/symex" xmlns:wpg="http://schemas.microsoft.com/office/word/2010/wordprocessingGroup" xmlns:wpi="http://schemas.microsoft.com/office/word/2010/wordprocessingInk" xmlns:wne="http://schemas.microsoft.com/office/word/2006/wordml" xmlns:wps="http://schemas.microsoft.com/office/word/2010/wordprocessingShape" mc:Ignorable="w14 w15 w16se w16cid w16 w16cex w16sdtdh w16sdtfl w16du wp14">
+  <w:abstractNum w:abstractNumId="0" w15:restartNumberingAfterBreak="0">
+    <w:nsid w:val="20534112"/>
+    <w:multiLevelType w:val="hybridMultilevel"/>
+    <w:tmpl w:val="D048FC66"/>
+    <w:lvl w:ilvl="0" w:tplc="E1A29CB2">
+      <w:start w:val="5"/>
+      <w:numFmt w:val="bullet"/>
+      <w:lvlText w:val="-"/>
+      <w:lvlJc w:val="left"/>
+      <w:pPr>
+        <w:ind w:left="720" w:hanging="360"/>
+      </w:pPr>
+      <w:rPr>
+        <w:rFonts w:ascii="Times New Roman" w:eastAsiaTheme="minorHAnsi" w:hAnsi="Times New Roman" w:cs="Times New Roman" w:hint="default"/>
+      </w:rPr>
+    </w:lvl>
+    <w:lvl w:ilvl="1" w:tplc="40090003" w:tentative="1">
+      <w:start w:val="1"/>
+      <w:numFmt w:val="bullet"/>
+      <w:lvlText w:val="o"/>
+      <w:lvlJc w:val="left"/>
+      <w:pPr>
+        <w:ind w:left="1440" w:hanging="360"/>
+      </w:pPr>
+      <w:rPr>
+        <w:rFonts w:ascii="Courier New" w:hAnsi="Courier New" w:cs="Courier New" w:hint="default"/>
+      </w:rPr>
+    </w:lvl>
+    <w:lvl w:ilvl="2" w:tplc="40090005" w:tentative="1">
+      <w:start w:val="1"/>
+      <w:numFmt w:val="bullet"/>
+      <w:lvlText w:val=""/>
+      <w:lvlJc w:val="left"/>
+      <w:pPr>
+        <w:ind w:left="2160" w:hanging="360"/>
+      </w:pPr>
+      <w:rPr>
+        <w:rFonts w:ascii="Wingdings" w:hAnsi="Wingdings" w:hint="default"/>
+      </w:rPr>
+    </w:lvl>
+    <w:lvl w:ilvl="3" w:tplc="40090001" w:tentative="1">
+      <w:start w:val="1"/>
+      <w:numFmt w:val="bullet"/>
+      <w:lvlText w:val=""/>
+      <w:lvlJc w:val="left"/>
+      <w:pPr>
+        <w:ind w:left="2880" w:hanging="360"/>
+      </w:pPr>
+      <w:rPr>
+        <w:rFonts w:ascii="Symbol" w:hAnsi="Symbol" w:hint="default"/>
+      </w:rPr>
+    </w:lvl>
+    <w:lvl w:ilvl="4" w:tplc="40090003" w:tentative="1">
+      <w:start w:val="1"/>
+      <w:numFmt w:val="bullet"/>
+      <w:lvlText w:val="o"/>
+      <w:lvlJc w:val="left"/>
+      <w:pPr>
+        <w:ind w:left="3600" w:hanging="360"/>
+      </w:pPr>
+      <w:rPr>
+        <w:rFonts w:ascii="Courier New" w:hAnsi="Courier New" w:cs="Courier New" w:hint="default"/>
+      </w:rPr>
+    </w:lvl>
+    <w:lvl w:ilvl="5" w:tplc="40090005" w:tentative="1">
+      <w:start w:val="1"/>
+      <w:numFmt w:val="bullet"/>
+      <w:lvlText w:val=""/>
+      <w:lvlJc w:val="left"/>
+      <w:pPr>
+        <w:ind w:left="4320" w:hanging="360"/>
+      </w:pPr>
+      <w:rPr>
+        <w:rFonts w:ascii="Wingdings" w:hAnsi="Wingdings" w:hint="default"/>
+      </w:rPr>
+    </w:lvl>
+    <w:lvl w:ilvl="6" w:tplc="40090001" w:tentative="1">
+      <w:start w:val="1"/>
+      <w:numFmt w:val="bullet"/>
+      <w:lvlText w:val=""/>
+      <w:lvlJc w:val="left"/>
+      <w:pPr>
+        <w:ind w:left="5040" w:hanging="360"/>
+      </w:pPr>
+      <w:rPr>
+        <w:rFonts w:ascii="Symbol" w:hAnsi="Symbol" w:hint="default"/>
+      </w:rPr>
+    </w:lvl>
+    <w:lvl w:ilvl="7" w:tplc="40090003" w:tentative="1">
+      <w:start w:val="1"/>
+      <w:numFmt w:val="bullet"/>
+      <w:lvlText w:val="o"/>
+      <w:lvlJc w:val="left"/>
+      <w:pPr>
+        <w:ind w:left="5760" w:hanging="360"/>
+      </w:pPr>
+      <w:rPr>
+        <w:rFonts w:ascii="Courier New" w:hAnsi="Courier New" w:cs="Courier New" w:hint="default"/>
+      </w:rPr>
+    </w:lvl>
+    <w:lvl w:ilvl="8" w:tplc="40090005" w:tentative="1">
+      <w:start w:val="1"/>
+      <w:numFmt w:val="bullet"/>
+      <w:lvlText w:val=""/>
+      <w:lvlJc w:val="left"/>
+      <w:pPr>
+        <w:ind w:left="6480" w:hanging="360"/>
+      </w:pPr>
+      <w:rPr>
+        <w:rFonts w:ascii="Wingdings" w:hAnsi="Wingdings" w:hint="default"/>
+      </w:rPr>
+    </w:lvl>
+  </w:abstractNum>
+  <w:num w:numId="1" w16cid:durableId="1088312575">
+    <w:abstractNumId w:val="0"/>
+  </w:num>
+</w:numbering>
 </file>
 
 <file path=word/styles.xml><?xml version="1.0" encoding="utf-8"?>
@@ -1012,6 +1759,49 @@
       <w:spacing w:val="5"/>
     </w:rPr>
   </w:style>
+  <w:style w:type="paragraph" w:styleId="TOCHeading">
+    <w:name w:val="TOC Heading"/>
+    <w:basedOn w:val="Heading1"/>
+    <w:next w:val="Normal"/>
+    <w:uiPriority w:val="39"/>
+    <w:unhideWhenUsed/>
+    <w:qFormat/>
+    <w:rsid w:val="0004060D"/>
+    <w:pPr>
+      <w:outlineLvl w:val="9"/>
+    </w:pPr>
+    <w:rPr>
+      <w:rFonts w:asciiTheme="majorHAnsi" w:hAnsiTheme="majorHAnsi"/>
+      <w:b w:val="0"/>
+      <w:color w:val="2F5496" w:themeColor="accent1" w:themeShade="BF"/>
+      <w:kern w:val="0"/>
+      <w:lang w:val="en-US"/>
+      <w14:ligatures w14:val="none"/>
+    </w:rPr>
+  </w:style>
+  <w:style w:type="paragraph" w:styleId="TOC1">
+    <w:name w:val="toc 1"/>
+    <w:basedOn w:val="Normal"/>
+    <w:next w:val="Normal"/>
+    <w:autoRedefine/>
+    <w:uiPriority w:val="39"/>
+    <w:unhideWhenUsed/>
+    <w:rsid w:val="0004060D"/>
+    <w:pPr>
+      <w:spacing w:after="100"/>
+    </w:pPr>
+  </w:style>
+  <w:style w:type="character" w:styleId="Hyperlink">
+    <w:name w:val="Hyperlink"/>
+    <w:basedOn w:val="DefaultParagraphFont"/>
+    <w:uiPriority w:val="99"/>
+    <w:unhideWhenUsed/>
+    <w:rsid w:val="0004060D"/>
+    <w:rPr>
+      <w:color w:val="0563C1" w:themeColor="hyperlink"/>
+      <w:u w:val="single"/>
+    </w:rPr>
+  </w:style>
 </w:styles>
 </file>
 
@@ -1308,4 +2098,16 @@
     </a:ext>
   </a:extLst>
 </a:theme>
+</file>
+
+<file path=customXml/item1.xml><?xml version="1.0" encoding="utf-8"?>
+<b:Sources xmlns:b="http://schemas.openxmlformats.org/officeDocument/2006/bibliography" xmlns="http://schemas.openxmlformats.org/officeDocument/2006/bibliography" SelectedStyle="\APASixthEditionOfficeOnline.xsl" StyleName="APA" Version="6"/>
+</file>
+
+<file path=customXml/itemProps1.xml><?xml version="1.0" encoding="utf-8"?>
+<ds:datastoreItem xmlns:ds="http://schemas.openxmlformats.org/officeDocument/2006/customXml" ds:itemID="{F3792BE4-4F82-46DF-AD24-BF3815E035D0}">
+  <ds:schemaRefs>
+    <ds:schemaRef ds:uri="http://schemas.openxmlformats.org/officeDocument/2006/bibliography"/>
+  </ds:schemaRefs>
+</ds:datastoreItem>
 </file>
</xml_diff>

<commit_message>
Dark Mode and Custom Colour Scheme
</commit_message>
<xml_diff>
--- a/Notes.docx
+++ b/Notes.docx
@@ -1390,6 +1390,941 @@
     </w:p>
     <w:p/>
     <w:p/>
+    <w:p/>
+    <w:p>
+      <w:pPr>
+        <w:pStyle w:val="Heading1"/>
+      </w:pPr>
+      <w:r>
+        <w:t>Light and Dark Mode</w:t>
+      </w:r>
+    </w:p>
+    <w:p/>
+    <w:tbl>
+      <w:tblPr>
+        <w:tblStyle w:val="TableGrid"/>
+        <w:tblW w:w="0" w:type="auto"/>
+        <w:tblLook w:val="04A0" w:firstRow="1" w:lastRow="0" w:firstColumn="1" w:lastColumn="0" w:noHBand="0" w:noVBand="1"/>
+      </w:tblPr>
+      <w:tblGrid>
+        <w:gridCol w:w="9016"/>
+      </w:tblGrid>
+      <w:tr>
+        <w:tc>
+          <w:tcPr>
+            <w:tcW w:w="9016" w:type="dxa"/>
+            <w:shd w:val="clear" w:color="auto" w:fill="BFBFBF" w:themeFill="background1" w:themeFillShade="BF"/>
+          </w:tcPr>
+          <w:p>
+            <w:r>
+              <w:t xml:space="preserve">function </w:t>
+            </w:r>
+            <w:proofErr w:type="spellStart"/>
+            <w:proofErr w:type="gramStart"/>
+            <w:r>
+              <w:t>ThemeChanger</w:t>
+            </w:r>
+            <w:proofErr w:type="spellEnd"/>
+            <w:r>
+              <w:t>(</w:t>
+            </w:r>
+            <w:proofErr w:type="gramEnd"/>
+            <w:r>
+              <w:t>) {</w:t>
+            </w:r>
+          </w:p>
+          <w:p>
+            <w:r>
+              <w:t xml:space="preserve">  </w:t>
+            </w:r>
+            <w:proofErr w:type="spellStart"/>
+            <w:r>
+              <w:t>const</w:t>
+            </w:r>
+            <w:proofErr w:type="spellEnd"/>
+            <w:r>
+              <w:t xml:space="preserve"> </w:t>
+            </w:r>
+            <w:proofErr w:type="gramStart"/>
+            <w:r>
+              <w:t>{ mode</w:t>
+            </w:r>
+            <w:proofErr w:type="gramEnd"/>
+            <w:r>
+              <w:t xml:space="preserve">, </w:t>
+            </w:r>
+            <w:proofErr w:type="spellStart"/>
+            <w:proofErr w:type="gramStart"/>
+            <w:r>
+              <w:t>setMode</w:t>
+            </w:r>
+            <w:proofErr w:type="spellEnd"/>
+            <w:r>
+              <w:t xml:space="preserve"> }</w:t>
+            </w:r>
+            <w:proofErr w:type="gramEnd"/>
+            <w:r>
+              <w:t xml:space="preserve"> = </w:t>
+            </w:r>
+            <w:proofErr w:type="spellStart"/>
+            <w:proofErr w:type="gramStart"/>
+            <w:r>
+              <w:t>useColorScheme</w:t>
+            </w:r>
+            <w:proofErr w:type="spellEnd"/>
+            <w:r>
+              <w:t>(</w:t>
+            </w:r>
+            <w:proofErr w:type="gramEnd"/>
+            <w:r>
+              <w:t>);</w:t>
+            </w:r>
+          </w:p>
+          <w:p>
+            <w:r>
+              <w:t>  if</w:t>
+            </w:r>
+            <w:proofErr w:type="gramStart"/>
+            <w:r>
+              <w:t>(!mode</w:t>
+            </w:r>
+            <w:proofErr w:type="gramEnd"/>
+            <w:r>
+              <w:t>) return null;</w:t>
+            </w:r>
+          </w:p>
+          <w:p/>
+          <w:p>
+            <w:r>
+              <w:t>  return (</w:t>
+            </w:r>
+          </w:p>
+          <w:p>
+            <w:r>
+              <w:t>    &lt;</w:t>
+            </w:r>
+            <w:proofErr w:type="spellStart"/>
+            <w:r>
+              <w:t>RadioGroup</w:t>
+            </w:r>
+            <w:proofErr w:type="spellEnd"/>
+          </w:p>
+          <w:p>
+            <w:r>
+              <w:t>      value={mode}</w:t>
+            </w:r>
+          </w:p>
+          <w:p>
+            <w:r>
+              <w:t xml:space="preserve">      </w:t>
+            </w:r>
+            <w:proofErr w:type="spellStart"/>
+            <w:r>
+              <w:t>onChange</w:t>
+            </w:r>
+            <w:proofErr w:type="spellEnd"/>
+            <w:r>
+              <w:t xml:space="preserve">={(e) =&gt; </w:t>
+            </w:r>
+            <w:proofErr w:type="spellStart"/>
+            <w:proofErr w:type="gramStart"/>
+            <w:r>
+              <w:t>setMode</w:t>
+            </w:r>
+            <w:proofErr w:type="spellEnd"/>
+            <w:r>
+              <w:t>(</w:t>
+            </w:r>
+            <w:proofErr w:type="spellStart"/>
+            <w:r>
+              <w:t>e.target</w:t>
+            </w:r>
+            <w:proofErr w:type="gramEnd"/>
+            <w:r>
+              <w:t>.value</w:t>
+            </w:r>
+            <w:proofErr w:type="spellEnd"/>
+            <w:r>
+              <w:t xml:space="preserve"> as "light" | "dark" | "system")}</w:t>
+            </w:r>
+          </w:p>
+          <w:p>
+            <w:r>
+              <w:t>    &gt;</w:t>
+            </w:r>
+          </w:p>
+          <w:p>
+            <w:r>
+              <w:lastRenderedPageBreak/>
+              <w:t>      &lt;</w:t>
+            </w:r>
+            <w:proofErr w:type="spellStart"/>
+            <w:r>
+              <w:t>FormControlLabel</w:t>
+            </w:r>
+            <w:proofErr w:type="spellEnd"/>
+            <w:r>
+              <w:t xml:space="preserve"> control</w:t>
+            </w:r>
+            <w:proofErr w:type="gramStart"/>
+            <w:r>
+              <w:t>={</w:t>
+            </w:r>
+            <w:proofErr w:type="gramEnd"/>
+            <w:r>
+              <w:t>&lt;Radio /&gt;} value={"system"} label="System" /&gt;</w:t>
+            </w:r>
+          </w:p>
+          <w:p>
+            <w:r>
+              <w:t>      &lt;</w:t>
+            </w:r>
+            <w:proofErr w:type="spellStart"/>
+            <w:r>
+              <w:t>FormControlLabel</w:t>
+            </w:r>
+            <w:proofErr w:type="spellEnd"/>
+            <w:r>
+              <w:t xml:space="preserve"> control</w:t>
+            </w:r>
+            <w:proofErr w:type="gramStart"/>
+            <w:r>
+              <w:t>={</w:t>
+            </w:r>
+            <w:proofErr w:type="gramEnd"/>
+            <w:r>
+              <w:t>&lt;Radio /&gt;} value={"light"} label="Light" /&gt;</w:t>
+            </w:r>
+          </w:p>
+          <w:p>
+            <w:r>
+              <w:t>      &lt;</w:t>
+            </w:r>
+            <w:proofErr w:type="spellStart"/>
+            <w:r>
+              <w:t>FormControlLabel</w:t>
+            </w:r>
+            <w:proofErr w:type="spellEnd"/>
+            <w:r>
+              <w:t xml:space="preserve"> control</w:t>
+            </w:r>
+            <w:proofErr w:type="gramStart"/>
+            <w:r>
+              <w:t>={</w:t>
+            </w:r>
+            <w:proofErr w:type="gramEnd"/>
+            <w:r>
+              <w:t>&lt;Radio /&gt;} value={"dark"} label="Dark" /&gt;</w:t>
+            </w:r>
+          </w:p>
+          <w:p>
+            <w:r>
+              <w:t>    &lt;/</w:t>
+            </w:r>
+            <w:proofErr w:type="spellStart"/>
+            <w:r>
+              <w:t>RadioGroup</w:t>
+            </w:r>
+            <w:proofErr w:type="spellEnd"/>
+            <w:r>
+              <w:t>&gt;</w:t>
+            </w:r>
+          </w:p>
+          <w:p>
+            <w:r>
+              <w:t>  );</w:t>
+            </w:r>
+          </w:p>
+          <w:p>
+            <w:r>
+              <w:t>}</w:t>
+            </w:r>
+          </w:p>
+          <w:p/>
+        </w:tc>
+      </w:tr>
+    </w:tbl>
+    <w:p/>
+    <w:p/>
+    <w:p>
+      <w:r>
+        <w:t xml:space="preserve">MUI provides a hook </w:t>
+      </w:r>
+      <w:proofErr w:type="spellStart"/>
+      <w:proofErr w:type="gramStart"/>
+      <w:r>
+        <w:t>useColorScheme</w:t>
+      </w:r>
+      <w:proofErr w:type="spellEnd"/>
+      <w:r>
+        <w:t>(</w:t>
+      </w:r>
+      <w:proofErr w:type="gramEnd"/>
+      <w:r>
+        <w:t>);</w:t>
+      </w:r>
+    </w:p>
+    <w:p/>
+    <w:p>
+      <w:pPr>
+        <w:pStyle w:val="ListParagraph"/>
+        <w:numPr>
+          <w:ilvl w:val="0"/>
+          <w:numId w:val="1"/>
+        </w:numPr>
+      </w:pPr>
+      <w:r>
+        <w:t xml:space="preserve">We can even change the dark and light </w:t>
+      </w:r>
+      <w:proofErr w:type="spellStart"/>
+      <w:r>
+        <w:t>color</w:t>
+      </w:r>
+      <w:proofErr w:type="spellEnd"/>
+      <w:r>
+        <w:t xml:space="preserve"> palette </w:t>
+      </w:r>
+    </w:p>
+    <w:tbl>
+      <w:tblPr>
+        <w:tblStyle w:val="TableGrid"/>
+        <w:tblW w:w="0" w:type="auto"/>
+        <w:tblInd w:w="720" w:type="dxa"/>
+        <w:tblLook w:val="04A0" w:firstRow="1" w:lastRow="0" w:firstColumn="1" w:lastColumn="0" w:noHBand="0" w:noVBand="1"/>
+      </w:tblPr>
+      <w:tblGrid>
+        <w:gridCol w:w="8296"/>
+      </w:tblGrid>
+      <w:tr>
+        <w:tc>
+          <w:tcPr>
+            <w:tcW w:w="9016" w:type="dxa"/>
+          </w:tcPr>
+          <w:p>
+            <w:pPr>
+              <w:pStyle w:val="ListParagraph"/>
+              <w:numPr>
+                <w:ilvl w:val="0"/>
+                <w:numId w:val="1"/>
+              </w:numPr>
+              <w:shd w:val="clear" w:color="auto" w:fill="1E1E1E"/>
+              <w:spacing w:line="345" w:lineRule="atLeast"/>
+              <w:rPr>
+                <w:rFonts w:ascii="Consolas" w:eastAsia="Times New Roman" w:hAnsi="Consolas" w:cs="Times New Roman"/>
+                <w:color w:val="D4D4D4"/>
+                <w:kern w:val="0"/>
+                <w:sz w:val="26"/>
+                <w:szCs w:val="26"/>
+                <w:lang w:eastAsia="en-IN" w:bidi="gu-IN"/>
+                <w14:ligatures w14:val="none"/>
+              </w:rPr>
+            </w:pPr>
+            <w:proofErr w:type="spellStart"/>
+            <w:r>
+              <w:rPr>
+                <w:rFonts w:ascii="Consolas" w:eastAsia="Times New Roman" w:hAnsi="Consolas" w:cs="Times New Roman"/>
+                <w:color w:val="569CD6"/>
+                <w:kern w:val="0"/>
+                <w:sz w:val="26"/>
+                <w:szCs w:val="26"/>
+                <w:lang w:eastAsia="en-IN" w:bidi="gu-IN"/>
+                <w14:ligatures w14:val="none"/>
+              </w:rPr>
+              <w:t>const</w:t>
+            </w:r>
+            <w:proofErr w:type="spellEnd"/>
+            <w:r>
+              <w:rPr>
+                <w:rFonts w:ascii="Consolas" w:eastAsia="Times New Roman" w:hAnsi="Consolas" w:cs="Times New Roman"/>
+                <w:color w:val="D4D4D4"/>
+                <w:kern w:val="0"/>
+                <w:sz w:val="26"/>
+                <w:szCs w:val="26"/>
+                <w:lang w:eastAsia="en-IN" w:bidi="gu-IN"/>
+                <w14:ligatures w14:val="none"/>
+              </w:rPr>
+              <w:t xml:space="preserve"> </w:t>
+            </w:r>
+            <w:r>
+              <w:rPr>
+                <w:rFonts w:ascii="Consolas" w:eastAsia="Times New Roman" w:hAnsi="Consolas" w:cs="Times New Roman"/>
+                <w:color w:val="C8C8C8"/>
+                <w:kern w:val="0"/>
+                <w:sz w:val="26"/>
+                <w:szCs w:val="26"/>
+                <w:lang w:eastAsia="en-IN" w:bidi="gu-IN"/>
+                <w14:ligatures w14:val="none"/>
+              </w:rPr>
+              <w:t>theme</w:t>
+            </w:r>
+            <w:r>
+              <w:rPr>
+                <w:rFonts w:ascii="Consolas" w:eastAsia="Times New Roman" w:hAnsi="Consolas" w:cs="Times New Roman"/>
+                <w:color w:val="D4D4D4"/>
+                <w:kern w:val="0"/>
+                <w:sz w:val="26"/>
+                <w:szCs w:val="26"/>
+                <w:lang w:eastAsia="en-IN" w:bidi="gu-IN"/>
+                <w14:ligatures w14:val="none"/>
+              </w:rPr>
+              <w:t xml:space="preserve"> = </w:t>
+            </w:r>
+            <w:proofErr w:type="spellStart"/>
+            <w:proofErr w:type="gramStart"/>
+            <w:r>
+              <w:rPr>
+                <w:rFonts w:ascii="Consolas" w:eastAsia="Times New Roman" w:hAnsi="Consolas" w:cs="Times New Roman"/>
+                <w:color w:val="C8C8C8"/>
+                <w:kern w:val="0"/>
+                <w:sz w:val="26"/>
+                <w:szCs w:val="26"/>
+                <w:lang w:eastAsia="en-IN" w:bidi="gu-IN"/>
+                <w14:ligatures w14:val="none"/>
+              </w:rPr>
+              <w:t>createTheme</w:t>
+            </w:r>
+            <w:proofErr w:type="spellEnd"/>
+            <w:r>
+              <w:rPr>
+                <w:rFonts w:ascii="Consolas" w:eastAsia="Times New Roman" w:hAnsi="Consolas" w:cs="Times New Roman"/>
+                <w:color w:val="D4D4D4"/>
+                <w:kern w:val="0"/>
+                <w:sz w:val="26"/>
+                <w:szCs w:val="26"/>
+                <w:lang w:eastAsia="en-IN" w:bidi="gu-IN"/>
+                <w14:ligatures w14:val="none"/>
+              </w:rPr>
+              <w:t>(</w:t>
+            </w:r>
+            <w:proofErr w:type="gramEnd"/>
+            <w:r>
+              <w:rPr>
+                <w:rFonts w:ascii="Consolas" w:eastAsia="Times New Roman" w:hAnsi="Consolas" w:cs="Times New Roman"/>
+                <w:color w:val="D4D4D4"/>
+                <w:kern w:val="0"/>
+                <w:sz w:val="26"/>
+                <w:szCs w:val="26"/>
+                <w:lang w:eastAsia="en-IN" w:bidi="gu-IN"/>
+                <w14:ligatures w14:val="none"/>
+              </w:rPr>
+              <w:t>{</w:t>
+            </w:r>
+          </w:p>
+          <w:p>
+            <w:pPr>
+              <w:pStyle w:val="ListParagraph"/>
+              <w:numPr>
+                <w:ilvl w:val="0"/>
+                <w:numId w:val="1"/>
+              </w:numPr>
+              <w:shd w:val="clear" w:color="auto" w:fill="1E1E1E"/>
+              <w:spacing w:line="345" w:lineRule="atLeast"/>
+              <w:rPr>
+                <w:rFonts w:ascii="Consolas" w:eastAsia="Times New Roman" w:hAnsi="Consolas" w:cs="Times New Roman"/>
+                <w:color w:val="D4D4D4"/>
+                <w:kern w:val="0"/>
+                <w:sz w:val="26"/>
+                <w:szCs w:val="26"/>
+                <w:lang w:eastAsia="en-IN" w:bidi="gu-IN"/>
+                <w14:ligatures w14:val="none"/>
+              </w:rPr>
+            </w:pPr>
+            <w:r>
+              <w:rPr>
+                <w:rFonts w:ascii="Consolas" w:eastAsia="Times New Roman" w:hAnsi="Consolas" w:cs="Times New Roman"/>
+                <w:color w:val="D4D4D4"/>
+                <w:kern w:val="0"/>
+                <w:sz w:val="26"/>
+                <w:szCs w:val="26"/>
+                <w:lang w:eastAsia="en-IN" w:bidi="gu-IN"/>
+                <w14:ligatures w14:val="none"/>
+              </w:rPr>
+              <w:t xml:space="preserve">  </w:t>
+            </w:r>
+            <w:proofErr w:type="spellStart"/>
+            <w:r>
+              <w:rPr>
+                <w:rFonts w:ascii="Consolas" w:eastAsia="Times New Roman" w:hAnsi="Consolas" w:cs="Times New Roman"/>
+                <w:color w:val="DADADA"/>
+                <w:kern w:val="0"/>
+                <w:sz w:val="26"/>
+                <w:szCs w:val="26"/>
+                <w:lang w:eastAsia="en-IN" w:bidi="gu-IN"/>
+                <w14:ligatures w14:val="none"/>
+              </w:rPr>
+              <w:t>colorSchemes</w:t>
+            </w:r>
+            <w:proofErr w:type="spellEnd"/>
+            <w:r>
+              <w:rPr>
+                <w:rFonts w:ascii="Consolas" w:eastAsia="Times New Roman" w:hAnsi="Consolas" w:cs="Times New Roman"/>
+                <w:color w:val="D4D4D4"/>
+                <w:kern w:val="0"/>
+                <w:sz w:val="26"/>
+                <w:szCs w:val="26"/>
+                <w:lang w:eastAsia="en-IN" w:bidi="gu-IN"/>
+                <w14:ligatures w14:val="none"/>
+              </w:rPr>
+              <w:t>: {</w:t>
+            </w:r>
+          </w:p>
+          <w:p>
+            <w:pPr>
+              <w:pStyle w:val="ListParagraph"/>
+              <w:numPr>
+                <w:ilvl w:val="0"/>
+                <w:numId w:val="1"/>
+              </w:numPr>
+              <w:shd w:val="clear" w:color="auto" w:fill="1E1E1E"/>
+              <w:spacing w:line="345" w:lineRule="atLeast"/>
+              <w:rPr>
+                <w:rFonts w:ascii="Consolas" w:eastAsia="Times New Roman" w:hAnsi="Consolas" w:cs="Times New Roman"/>
+                <w:color w:val="D4D4D4"/>
+                <w:kern w:val="0"/>
+                <w:sz w:val="26"/>
+                <w:szCs w:val="26"/>
+                <w:lang w:eastAsia="en-IN" w:bidi="gu-IN"/>
+                <w14:ligatures w14:val="none"/>
+              </w:rPr>
+            </w:pPr>
+            <w:r>
+              <w:rPr>
+                <w:rFonts w:ascii="Consolas" w:eastAsia="Times New Roman" w:hAnsi="Consolas" w:cs="Times New Roman"/>
+                <w:color w:val="D4D4D4"/>
+                <w:kern w:val="0"/>
+                <w:sz w:val="26"/>
+                <w:szCs w:val="26"/>
+                <w:lang w:eastAsia="en-IN" w:bidi="gu-IN"/>
+                <w14:ligatures w14:val="none"/>
+              </w:rPr>
+              <w:t xml:space="preserve">    </w:t>
+            </w:r>
+            <w:r>
+              <w:rPr>
+                <w:rFonts w:ascii="Consolas" w:eastAsia="Times New Roman" w:hAnsi="Consolas" w:cs="Times New Roman"/>
+                <w:color w:val="6A9955"/>
+                <w:kern w:val="0"/>
+                <w:sz w:val="26"/>
+                <w:szCs w:val="26"/>
+                <w:lang w:eastAsia="en-IN" w:bidi="gu-IN"/>
+                <w14:ligatures w14:val="none"/>
+              </w:rPr>
+              <w:t>// dark: true,</w:t>
+            </w:r>
+          </w:p>
+          <w:p>
+            <w:pPr>
+              <w:pStyle w:val="ListParagraph"/>
+              <w:numPr>
+                <w:ilvl w:val="0"/>
+                <w:numId w:val="1"/>
+              </w:numPr>
+              <w:shd w:val="clear" w:color="auto" w:fill="1E1E1E"/>
+              <w:spacing w:line="345" w:lineRule="atLeast"/>
+              <w:rPr>
+                <w:rFonts w:ascii="Consolas" w:eastAsia="Times New Roman" w:hAnsi="Consolas" w:cs="Times New Roman"/>
+                <w:color w:val="D4D4D4"/>
+                <w:kern w:val="0"/>
+                <w:sz w:val="26"/>
+                <w:szCs w:val="26"/>
+                <w:lang w:eastAsia="en-IN" w:bidi="gu-IN"/>
+                <w14:ligatures w14:val="none"/>
+              </w:rPr>
+            </w:pPr>
+            <w:r>
+              <w:rPr>
+                <w:rFonts w:ascii="Consolas" w:eastAsia="Times New Roman" w:hAnsi="Consolas" w:cs="Times New Roman"/>
+                <w:color w:val="D4D4D4"/>
+                <w:kern w:val="0"/>
+                <w:sz w:val="26"/>
+                <w:szCs w:val="26"/>
+                <w:lang w:eastAsia="en-IN" w:bidi="gu-IN"/>
+                <w14:ligatures w14:val="none"/>
+              </w:rPr>
+              <w:t xml:space="preserve">    </w:t>
+            </w:r>
+            <w:r>
+              <w:rPr>
+                <w:rFonts w:ascii="Consolas" w:eastAsia="Times New Roman" w:hAnsi="Consolas" w:cs="Times New Roman"/>
+                <w:color w:val="DADADA"/>
+                <w:kern w:val="0"/>
+                <w:sz w:val="26"/>
+                <w:szCs w:val="26"/>
+                <w:lang w:eastAsia="en-IN" w:bidi="gu-IN"/>
+                <w14:ligatures w14:val="none"/>
+              </w:rPr>
+              <w:t>dark</w:t>
+            </w:r>
+            <w:r>
+              <w:rPr>
+                <w:rFonts w:ascii="Consolas" w:eastAsia="Times New Roman" w:hAnsi="Consolas" w:cs="Times New Roman"/>
+                <w:color w:val="D4D4D4"/>
+                <w:kern w:val="0"/>
+                <w:sz w:val="26"/>
+                <w:szCs w:val="26"/>
+                <w:lang w:eastAsia="en-IN" w:bidi="gu-IN"/>
+                <w14:ligatures w14:val="none"/>
+              </w:rPr>
+              <w:t>: {</w:t>
+            </w:r>
+          </w:p>
+          <w:p>
+            <w:pPr>
+              <w:pStyle w:val="ListParagraph"/>
+              <w:numPr>
+                <w:ilvl w:val="0"/>
+                <w:numId w:val="1"/>
+              </w:numPr>
+              <w:shd w:val="clear" w:color="auto" w:fill="1E1E1E"/>
+              <w:spacing w:line="345" w:lineRule="atLeast"/>
+              <w:rPr>
+                <w:rFonts w:ascii="Consolas" w:eastAsia="Times New Roman" w:hAnsi="Consolas" w:cs="Times New Roman"/>
+                <w:color w:val="D4D4D4"/>
+                <w:kern w:val="0"/>
+                <w:sz w:val="26"/>
+                <w:szCs w:val="26"/>
+                <w:lang w:eastAsia="en-IN" w:bidi="gu-IN"/>
+                <w14:ligatures w14:val="none"/>
+              </w:rPr>
+            </w:pPr>
+            <w:r>
+              <w:rPr>
+                <w:rFonts w:ascii="Consolas" w:eastAsia="Times New Roman" w:hAnsi="Consolas" w:cs="Times New Roman"/>
+                <w:color w:val="D4D4D4"/>
+                <w:kern w:val="0"/>
+                <w:sz w:val="26"/>
+                <w:szCs w:val="26"/>
+                <w:lang w:eastAsia="en-IN" w:bidi="gu-IN"/>
+                <w14:ligatures w14:val="none"/>
+              </w:rPr>
+              <w:t xml:space="preserve">        </w:t>
+            </w:r>
+            <w:r>
+              <w:rPr>
+                <w:rFonts w:ascii="Consolas" w:eastAsia="Times New Roman" w:hAnsi="Consolas" w:cs="Times New Roman"/>
+                <w:color w:val="DADADA"/>
+                <w:kern w:val="0"/>
+                <w:sz w:val="26"/>
+                <w:szCs w:val="26"/>
+                <w:lang w:eastAsia="en-IN" w:bidi="gu-IN"/>
+                <w14:ligatures w14:val="none"/>
+              </w:rPr>
+              <w:t>palette</w:t>
+            </w:r>
+            <w:r>
+              <w:rPr>
+                <w:rFonts w:ascii="Consolas" w:eastAsia="Times New Roman" w:hAnsi="Consolas" w:cs="Times New Roman"/>
+                <w:color w:val="D4D4D4"/>
+                <w:kern w:val="0"/>
+                <w:sz w:val="26"/>
+                <w:szCs w:val="26"/>
+                <w:lang w:eastAsia="en-IN" w:bidi="gu-IN"/>
+                <w14:ligatures w14:val="none"/>
+              </w:rPr>
+              <w:t>: {</w:t>
+            </w:r>
+          </w:p>
+          <w:p>
+            <w:pPr>
+              <w:pStyle w:val="ListParagraph"/>
+              <w:numPr>
+                <w:ilvl w:val="0"/>
+                <w:numId w:val="1"/>
+              </w:numPr>
+              <w:shd w:val="clear" w:color="auto" w:fill="1E1E1E"/>
+              <w:spacing w:line="345" w:lineRule="atLeast"/>
+              <w:rPr>
+                <w:rFonts w:ascii="Consolas" w:eastAsia="Times New Roman" w:hAnsi="Consolas" w:cs="Times New Roman"/>
+                <w:color w:val="D4D4D4"/>
+                <w:kern w:val="0"/>
+                <w:sz w:val="26"/>
+                <w:szCs w:val="26"/>
+                <w:lang w:eastAsia="en-IN" w:bidi="gu-IN"/>
+                <w14:ligatures w14:val="none"/>
+              </w:rPr>
+            </w:pPr>
+            <w:r>
+              <w:rPr>
+                <w:rFonts w:ascii="Consolas" w:eastAsia="Times New Roman" w:hAnsi="Consolas" w:cs="Times New Roman"/>
+                <w:color w:val="D4D4D4"/>
+                <w:kern w:val="0"/>
+                <w:sz w:val="26"/>
+                <w:szCs w:val="26"/>
+                <w:lang w:eastAsia="en-IN" w:bidi="gu-IN"/>
+                <w14:ligatures w14:val="none"/>
+              </w:rPr>
+              <w:t xml:space="preserve">            </w:t>
+            </w:r>
+            <w:r>
+              <w:rPr>
+                <w:rFonts w:ascii="Consolas" w:eastAsia="Times New Roman" w:hAnsi="Consolas" w:cs="Times New Roman"/>
+                <w:color w:val="DADADA"/>
+                <w:kern w:val="0"/>
+                <w:sz w:val="26"/>
+                <w:szCs w:val="26"/>
+                <w:lang w:eastAsia="en-IN" w:bidi="gu-IN"/>
+                <w14:ligatures w14:val="none"/>
+              </w:rPr>
+              <w:t>primary</w:t>
+            </w:r>
+            <w:r>
+              <w:rPr>
+                <w:rFonts w:ascii="Consolas" w:eastAsia="Times New Roman" w:hAnsi="Consolas" w:cs="Times New Roman"/>
+                <w:color w:val="D4D4D4"/>
+                <w:kern w:val="0"/>
+                <w:sz w:val="26"/>
+                <w:szCs w:val="26"/>
+                <w:lang w:eastAsia="en-IN" w:bidi="gu-IN"/>
+                <w14:ligatures w14:val="none"/>
+              </w:rPr>
+              <w:t>: {</w:t>
+            </w:r>
+          </w:p>
+          <w:p>
+            <w:pPr>
+              <w:pStyle w:val="ListParagraph"/>
+              <w:numPr>
+                <w:ilvl w:val="0"/>
+                <w:numId w:val="1"/>
+              </w:numPr>
+              <w:shd w:val="clear" w:color="auto" w:fill="1E1E1E"/>
+              <w:spacing w:line="345" w:lineRule="atLeast"/>
+              <w:rPr>
+                <w:rFonts w:ascii="Consolas" w:eastAsia="Times New Roman" w:hAnsi="Consolas" w:cs="Times New Roman"/>
+                <w:b/>
+                <w:bCs/>
+                <w:color w:val="D4D4D4"/>
+                <w:kern w:val="0"/>
+                <w:sz w:val="26"/>
+                <w:szCs w:val="26"/>
+                <w:u w:val="single"/>
+                <w:lang w:eastAsia="en-IN" w:bidi="gu-IN"/>
+                <w14:ligatures w14:val="none"/>
+              </w:rPr>
+            </w:pPr>
+            <w:r>
+              <w:rPr>
+                <w:rFonts w:ascii="Consolas" w:eastAsia="Times New Roman" w:hAnsi="Consolas" w:cs="Times New Roman"/>
+                <w:color w:val="D4D4D4"/>
+                <w:kern w:val="0"/>
+                <w:sz w:val="26"/>
+                <w:szCs w:val="26"/>
+                <w:lang w:eastAsia="en-IN" w:bidi="gu-IN"/>
+                <w14:ligatures w14:val="none"/>
+              </w:rPr>
+              <w:t xml:space="preserve">                </w:t>
+            </w:r>
+            <w:r>
+              <w:rPr>
+                <w:rFonts w:ascii="Consolas" w:eastAsia="Times New Roman" w:hAnsi="Consolas" w:cs="Times New Roman"/>
+                <w:b/>
+                <w:bCs/>
+                <w:color w:val="DADADA"/>
+                <w:kern w:val="0"/>
+                <w:sz w:val="26"/>
+                <w:szCs w:val="26"/>
+                <w:u w:val="single"/>
+                <w:lang w:eastAsia="en-IN" w:bidi="gu-IN"/>
+                <w14:ligatures w14:val="none"/>
+              </w:rPr>
+              <w:t>main</w:t>
+            </w:r>
+            <w:r>
+              <w:rPr>
+                <w:rFonts w:ascii="Consolas" w:eastAsia="Times New Roman" w:hAnsi="Consolas" w:cs="Times New Roman"/>
+                <w:b/>
+                <w:bCs/>
+                <w:color w:val="D4D4D4"/>
+                <w:kern w:val="0"/>
+                <w:sz w:val="26"/>
+                <w:szCs w:val="26"/>
+                <w:u w:val="single"/>
+                <w:lang w:eastAsia="en-IN" w:bidi="gu-IN"/>
+                <w14:ligatures w14:val="none"/>
+              </w:rPr>
+              <w:t xml:space="preserve">: </w:t>
+            </w:r>
+            <w:r>
+              <w:rPr>
+                <w:rFonts w:ascii="Consolas" w:eastAsia="Times New Roman" w:hAnsi="Consolas" w:cs="Times New Roman"/>
+                <w:b/>
+                <w:bCs/>
+                <w:color w:val="CE9178"/>
+                <w:kern w:val="0"/>
+                <w:sz w:val="26"/>
+                <w:szCs w:val="26"/>
+                <w:u w:val="single"/>
+                <w:lang w:eastAsia="en-IN" w:bidi="gu-IN"/>
+                <w14:ligatures w14:val="none"/>
+              </w:rPr>
+              <w:t>'#543345'</w:t>
+            </w:r>
+          </w:p>
+          <w:p>
+            <w:pPr>
+              <w:pStyle w:val="ListParagraph"/>
+              <w:numPr>
+                <w:ilvl w:val="0"/>
+                <w:numId w:val="1"/>
+              </w:numPr>
+              <w:shd w:val="clear" w:color="auto" w:fill="1E1E1E"/>
+              <w:spacing w:line="345" w:lineRule="atLeast"/>
+              <w:rPr>
+                <w:rFonts w:ascii="Consolas" w:eastAsia="Times New Roman" w:hAnsi="Consolas" w:cs="Times New Roman"/>
+                <w:color w:val="D4D4D4"/>
+                <w:kern w:val="0"/>
+                <w:sz w:val="26"/>
+                <w:szCs w:val="26"/>
+                <w:lang w:eastAsia="en-IN" w:bidi="gu-IN"/>
+                <w14:ligatures w14:val="none"/>
+              </w:rPr>
+            </w:pPr>
+            <w:r>
+              <w:rPr>
+                <w:rFonts w:ascii="Consolas" w:eastAsia="Times New Roman" w:hAnsi="Consolas" w:cs="Times New Roman"/>
+                <w:color w:val="D4D4D4"/>
+                <w:kern w:val="0"/>
+                <w:sz w:val="26"/>
+                <w:szCs w:val="26"/>
+                <w:lang w:eastAsia="en-IN" w:bidi="gu-IN"/>
+                <w14:ligatures w14:val="none"/>
+              </w:rPr>
+              <w:t>            }</w:t>
+            </w:r>
+          </w:p>
+          <w:p>
+            <w:pPr>
+              <w:pStyle w:val="ListParagraph"/>
+              <w:numPr>
+                <w:ilvl w:val="0"/>
+                <w:numId w:val="1"/>
+              </w:numPr>
+              <w:shd w:val="clear" w:color="auto" w:fill="1E1E1E"/>
+              <w:spacing w:line="345" w:lineRule="atLeast"/>
+              <w:rPr>
+                <w:rFonts w:ascii="Consolas" w:eastAsia="Times New Roman" w:hAnsi="Consolas" w:cs="Times New Roman"/>
+                <w:color w:val="D4D4D4"/>
+                <w:kern w:val="0"/>
+                <w:sz w:val="26"/>
+                <w:szCs w:val="26"/>
+                <w:lang w:eastAsia="en-IN" w:bidi="gu-IN"/>
+                <w14:ligatures w14:val="none"/>
+              </w:rPr>
+            </w:pPr>
+            <w:r>
+              <w:rPr>
+                <w:rFonts w:ascii="Consolas" w:eastAsia="Times New Roman" w:hAnsi="Consolas" w:cs="Times New Roman"/>
+                <w:color w:val="D4D4D4"/>
+                <w:kern w:val="0"/>
+                <w:sz w:val="26"/>
+                <w:szCs w:val="26"/>
+                <w:lang w:eastAsia="en-IN" w:bidi="gu-IN"/>
+                <w14:ligatures w14:val="none"/>
+              </w:rPr>
+              <w:t>        }</w:t>
+            </w:r>
+          </w:p>
+          <w:p>
+            <w:pPr>
+              <w:pStyle w:val="ListParagraph"/>
+              <w:numPr>
+                <w:ilvl w:val="0"/>
+                <w:numId w:val="1"/>
+              </w:numPr>
+              <w:shd w:val="clear" w:color="auto" w:fill="1E1E1E"/>
+              <w:spacing w:line="345" w:lineRule="atLeast"/>
+              <w:rPr>
+                <w:rFonts w:ascii="Consolas" w:eastAsia="Times New Roman" w:hAnsi="Consolas" w:cs="Times New Roman"/>
+                <w:color w:val="D4D4D4"/>
+                <w:kern w:val="0"/>
+                <w:sz w:val="26"/>
+                <w:szCs w:val="26"/>
+                <w:lang w:eastAsia="en-IN" w:bidi="gu-IN"/>
+                <w14:ligatures w14:val="none"/>
+              </w:rPr>
+            </w:pPr>
+            <w:r>
+              <w:rPr>
+                <w:rFonts w:ascii="Consolas" w:eastAsia="Times New Roman" w:hAnsi="Consolas" w:cs="Times New Roman"/>
+                <w:color w:val="D4D4D4"/>
+                <w:kern w:val="0"/>
+                <w:sz w:val="26"/>
+                <w:szCs w:val="26"/>
+                <w:lang w:eastAsia="en-IN" w:bidi="gu-IN"/>
+                <w14:ligatures w14:val="none"/>
+              </w:rPr>
+              <w:t>    }</w:t>
+            </w:r>
+          </w:p>
+          <w:p>
+            <w:pPr>
+              <w:pStyle w:val="ListParagraph"/>
+              <w:numPr>
+                <w:ilvl w:val="0"/>
+                <w:numId w:val="1"/>
+              </w:numPr>
+              <w:shd w:val="clear" w:color="auto" w:fill="1E1E1E"/>
+              <w:spacing w:line="345" w:lineRule="atLeast"/>
+              <w:rPr>
+                <w:rFonts w:ascii="Consolas" w:eastAsia="Times New Roman" w:hAnsi="Consolas" w:cs="Times New Roman"/>
+                <w:color w:val="D4D4D4"/>
+                <w:kern w:val="0"/>
+                <w:sz w:val="26"/>
+                <w:szCs w:val="26"/>
+                <w:lang w:eastAsia="en-IN" w:bidi="gu-IN"/>
+                <w14:ligatures w14:val="none"/>
+              </w:rPr>
+            </w:pPr>
+            <w:r>
+              <w:rPr>
+                <w:rFonts w:ascii="Consolas" w:eastAsia="Times New Roman" w:hAnsi="Consolas" w:cs="Times New Roman"/>
+                <w:color w:val="D4D4D4"/>
+                <w:kern w:val="0"/>
+                <w:sz w:val="26"/>
+                <w:szCs w:val="26"/>
+                <w:lang w:eastAsia="en-IN" w:bidi="gu-IN"/>
+                <w14:ligatures w14:val="none"/>
+              </w:rPr>
+              <w:t>  },</w:t>
+            </w:r>
+          </w:p>
+          <w:p>
+            <w:pPr>
+              <w:pStyle w:val="ListParagraph"/>
+            </w:pPr>
+          </w:p>
+        </w:tc>
+      </w:tr>
+    </w:tbl>
+    <w:p>
+      <w:pPr>
+        <w:pStyle w:val="ListParagraph"/>
+      </w:pPr>
+    </w:p>
+    <w:p>
+      <w:pPr>
+        <w:pStyle w:val="ListParagraph"/>
+      </w:pPr>
+      <w:r>
+        <w:t xml:space="preserve">- Note: That If we are defining </w:t>
+      </w:r>
+      <w:proofErr w:type="spellStart"/>
+      <w:r>
+        <w:t>any thing</w:t>
+      </w:r>
+      <w:proofErr w:type="spellEnd"/>
+      <w:r>
+        <w:t xml:space="preserve"> like here in </w:t>
+      </w:r>
+      <w:proofErr w:type="gramStart"/>
+      <w:r>
+        <w:t>primary:{</w:t>
+      </w:r>
+      <w:proofErr w:type="gramEnd"/>
+      <w:r>
+        <w:t>} then defining “main” is must – Other shades and weights MUI will automatically generate.</w:t>
+      </w:r>
+    </w:p>
     <w:sectPr>
       <w:pgSz w:w="11906" w:h="16838"/>
       <w:pgMar w:top="1440" w:right="1440" w:bottom="1440" w:left="1440" w:header="708" w:footer="708" w:gutter="0"/>

</xml_diff>

<commit_message>
responsive design: Grid and container
</commit_message>
<xml_diff>
--- a/Notes.docx
+++ b/Notes.docx
@@ -80,7 +80,7 @@
           <w:r>
             <w:fldChar w:fldCharType="separate"/>
           </w:r>
-          <w:hyperlink w:anchor="_Toc229039668" w:history="1">
+          <w:hyperlink w:anchor="_Toc229130558" w:history="1">
             <w:r>
               <w:rPr>
                 <w:rStyle w:val="Hyperlink"/>
@@ -107,7 +107,7 @@
                 <w:noProof/>
                 <w:webHidden/>
               </w:rPr>
-              <w:instrText xml:space="preserve"> PAGEREF _Toc229039668 \h </w:instrText>
+              <w:instrText xml:space="preserve"> PAGEREF _Toc229130558 \h </w:instrText>
             </w:r>
             <w:r>
               <w:rPr>
@@ -151,7 +151,7 @@
               <w:lang w:eastAsia="en-IN" w:bidi="gu-IN"/>
             </w:rPr>
           </w:pPr>
-          <w:hyperlink w:anchor="_Toc229039669" w:history="1">
+          <w:hyperlink w:anchor="_Toc229130559" w:history="1">
             <w:r>
               <w:rPr>
                 <w:rStyle w:val="Hyperlink"/>
@@ -178,7 +178,7 @@
                 <w:noProof/>
                 <w:webHidden/>
               </w:rPr>
-              <w:instrText xml:space="preserve"> PAGEREF _Toc229039669 \h </w:instrText>
+              <w:instrText xml:space="preserve"> PAGEREF _Toc229130559 \h </w:instrText>
             </w:r>
             <w:r>
               <w:rPr>
@@ -222,27 +222,155 @@
               <w:lang w:eastAsia="en-IN" w:bidi="gu-IN"/>
             </w:rPr>
           </w:pPr>
-          <w:hyperlink w:anchor="_Toc229039670" w:history="1">
+          <w:hyperlink w:anchor="_Toc229130560" w:history="1">
             <w:r>
               <w:rPr>
                 <w:rStyle w:val="Hyperlink"/>
                 <w:noProof/>
               </w:rPr>
-              <w:t>Customizing with sx={</w:t>
-            </w:r>
+              <w:t>Customizing with sx={{}}</w:t>
+            </w:r>
+            <w:r>
+              <w:rPr>
+                <w:noProof/>
+                <w:webHidden/>
+              </w:rPr>
+              <w:tab/>
+            </w:r>
+            <w:r>
+              <w:rPr>
+                <w:noProof/>
+                <w:webHidden/>
+              </w:rPr>
+              <w:fldChar w:fldCharType="begin"/>
+            </w:r>
+            <w:r>
+              <w:rPr>
+                <w:noProof/>
+                <w:webHidden/>
+              </w:rPr>
+              <w:instrText xml:space="preserve"> PAGEREF _Toc229130560 \h </w:instrText>
+            </w:r>
+            <w:r>
+              <w:rPr>
+                <w:noProof/>
+                <w:webHidden/>
+              </w:rPr>
+            </w:r>
+            <w:r>
+              <w:rPr>
+                <w:noProof/>
+                <w:webHidden/>
+              </w:rPr>
+              <w:fldChar w:fldCharType="separate"/>
+            </w:r>
+            <w:r>
+              <w:rPr>
+                <w:noProof/>
+                <w:webHidden/>
+              </w:rPr>
+              <w:t>2</w:t>
+            </w:r>
+            <w:r>
+              <w:rPr>
+                <w:noProof/>
+                <w:webHidden/>
+              </w:rPr>
+              <w:fldChar w:fldCharType="end"/>
+            </w:r>
+          </w:hyperlink>
+        </w:p>
+        <w:p>
+          <w:pPr>
+            <w:pStyle w:val="TOC1"/>
+            <w:tabs>
+              <w:tab w:val="right" w:leader="dot" w:pos="9016"/>
+            </w:tabs>
+            <w:rPr>
+              <w:rFonts w:asciiTheme="minorHAnsi" w:eastAsiaTheme="minorEastAsia" w:hAnsiTheme="minorHAnsi"/>
+              <w:noProof/>
+              <w:szCs w:val="24"/>
+              <w:lang w:eastAsia="en-IN" w:bidi="gu-IN"/>
+            </w:rPr>
+          </w:pPr>
+          <w:hyperlink w:anchor="_Toc229130561" w:history="1">
             <w:r>
               <w:rPr>
                 <w:rStyle w:val="Hyperlink"/>
                 <w:noProof/>
               </w:rPr>
-              <w:t>{</w:t>
-            </w:r>
+              <w:t>Creating Reusable Styled Components</w:t>
+            </w:r>
+            <w:r>
+              <w:rPr>
+                <w:noProof/>
+                <w:webHidden/>
+              </w:rPr>
+              <w:tab/>
+            </w:r>
+            <w:r>
+              <w:rPr>
+                <w:noProof/>
+                <w:webHidden/>
+              </w:rPr>
+              <w:fldChar w:fldCharType="begin"/>
+            </w:r>
+            <w:r>
+              <w:rPr>
+                <w:noProof/>
+                <w:webHidden/>
+              </w:rPr>
+              <w:instrText xml:space="preserve"> PAGEREF _Toc229130561 \h </w:instrText>
+            </w:r>
+            <w:r>
+              <w:rPr>
+                <w:noProof/>
+                <w:webHidden/>
+              </w:rPr>
+            </w:r>
+            <w:r>
+              <w:rPr>
+                <w:noProof/>
+                <w:webHidden/>
+              </w:rPr>
+              <w:fldChar w:fldCharType="separate"/>
+            </w:r>
+            <w:r>
+              <w:rPr>
+                <w:noProof/>
+                <w:webHidden/>
+              </w:rPr>
+              <w:t>3</w:t>
+            </w:r>
+            <w:r>
+              <w:rPr>
+                <w:noProof/>
+                <w:webHidden/>
+              </w:rPr>
+              <w:fldChar w:fldCharType="end"/>
+            </w:r>
+          </w:hyperlink>
+        </w:p>
+        <w:p>
+          <w:pPr>
+            <w:pStyle w:val="TOC1"/>
+            <w:tabs>
+              <w:tab w:val="right" w:leader="dot" w:pos="9016"/>
+            </w:tabs>
+            <w:rPr>
+              <w:rFonts w:asciiTheme="minorHAnsi" w:eastAsiaTheme="minorEastAsia" w:hAnsiTheme="minorHAnsi"/>
+              <w:noProof/>
+              <w:szCs w:val="24"/>
+              <w:lang w:eastAsia="en-IN" w:bidi="gu-IN"/>
+            </w:rPr>
+          </w:pPr>
+          <w:hyperlink w:anchor="_Toc229130562" w:history="1">
             <w:r>
               <w:rPr>
                 <w:rStyle w:val="Hyperlink"/>
                 <w:noProof/>
               </w:rPr>
-              <w:t>}}</w:t>
+              <w:t>Overriding Global Theme</w:t>
             </w:r>
             <w:r>
               <w:rPr>
@@ -263,7 +391,7 @@
                 <w:noProof/>
                 <w:webHidden/>
               </w:rPr>
-              <w:instrText xml:space="preserve"> PAGEREF _Toc229039670 \h </w:instrText>
+              <w:instrText xml:space="preserve"> PAGEREF _Toc229130562 \h </w:instrText>
             </w:r>
             <w:r>
               <w:rPr>
@@ -283,7 +411,92 @@
                 <w:noProof/>
                 <w:webHidden/>
               </w:rPr>
-              <w:t>2</w:t>
+              <w:t>4</w:t>
+            </w:r>
+            <w:r>
+              <w:rPr>
+                <w:noProof/>
+                <w:webHidden/>
+              </w:rPr>
+              <w:fldChar w:fldCharType="end"/>
+            </w:r>
+          </w:hyperlink>
+        </w:p>
+        <w:p>
+          <w:pPr>
+            <w:pStyle w:val="TOC1"/>
+            <w:tabs>
+              <w:tab w:val="right" w:leader="dot" w:pos="9016"/>
+            </w:tabs>
+            <w:rPr>
+              <w:rFonts w:asciiTheme="minorHAnsi" w:eastAsiaTheme="minorEastAsia" w:hAnsiTheme="minorHAnsi"/>
+              <w:noProof/>
+              <w:szCs w:val="24"/>
+              <w:lang w:eastAsia="en-IN" w:bidi="gu-IN"/>
+            </w:rPr>
+          </w:pPr>
+          <w:hyperlink w:anchor="_Toc229130563" w:history="1">
+            <w:r>
+              <w:rPr>
+                <w:rStyle w:val="Hyperlink"/>
+                <w:noProof/>
+              </w:rPr>
+              <w:t>Light and Dark Mo</w:t>
+            </w:r>
+            <w:r>
+              <w:rPr>
+                <w:rStyle w:val="Hyperlink"/>
+                <w:noProof/>
+              </w:rPr>
+              <w:t>d</w:t>
+            </w:r>
+            <w:r>
+              <w:rPr>
+                <w:rStyle w:val="Hyperlink"/>
+                <w:noProof/>
+              </w:rPr>
+              <w:t>e</w:t>
+            </w:r>
+            <w:r>
+              <w:rPr>
+                <w:noProof/>
+                <w:webHidden/>
+              </w:rPr>
+              <w:tab/>
+            </w:r>
+            <w:r>
+              <w:rPr>
+                <w:noProof/>
+                <w:webHidden/>
+              </w:rPr>
+              <w:fldChar w:fldCharType="begin"/>
+            </w:r>
+            <w:r>
+              <w:rPr>
+                <w:noProof/>
+                <w:webHidden/>
+              </w:rPr>
+              <w:instrText xml:space="preserve"> PAGEREF _Toc229130563 \h </w:instrText>
+            </w:r>
+            <w:r>
+              <w:rPr>
+                <w:noProof/>
+                <w:webHidden/>
+              </w:rPr>
+            </w:r>
+            <w:r>
+              <w:rPr>
+                <w:noProof/>
+                <w:webHidden/>
+              </w:rPr>
+              <w:fldChar w:fldCharType="separate"/>
+            </w:r>
+            <w:r>
+              <w:rPr>
+                <w:noProof/>
+                <w:webHidden/>
+              </w:rPr>
+              <w:t>4</w:t>
             </w:r>
             <w:r>
               <w:rPr>
@@ -321,7 +534,7 @@
       <w:pPr>
         <w:pStyle w:val="Heading1"/>
       </w:pPr>
-      <w:bookmarkStart w:id="0" w:name="_Toc229039668"/>
+      <w:bookmarkStart w:id="0" w:name="_Toc229130558"/>
       <w:r>
         <w:t>Components:</w:t>
       </w:r>
@@ -345,21 +558,8 @@
         <w:sym w:font="Wingdings" w:char="F0E0"/>
       </w:r>
       <w:r>
-        <w:t xml:space="preserve"> To make it </w:t>
-      </w:r>
-      <w:proofErr w:type="spellStart"/>
-      <w:r>
-        <w:t>Every thing</w:t>
-      </w:r>
-      <w:proofErr w:type="spellEnd"/>
-      <w:r>
-        <w:t xml:space="preserve"> in </w:t>
-      </w:r>
-      <w:proofErr w:type="spellStart"/>
-      <w:r>
-        <w:t>center</w:t>
-      </w:r>
-      <w:proofErr w:type="spellEnd"/>
+        <w:t xml:space="preserve"> To make it Every thing in center</w:t>
+      </w:r>
     </w:p>
     <w:p>
       <w:r>
@@ -368,15 +568,7 @@
     </w:p>
     <w:p>
       <w:r>
-        <w:t>&lt;</w:t>
-      </w:r>
-      <w:proofErr w:type="spellStart"/>
-      <w:r>
-        <w:t>TextField</w:t>
-      </w:r>
-      <w:proofErr w:type="spellEnd"/>
-      <w:r>
-        <w:t xml:space="preserve"> /&gt;</w:t>
+        <w:t>&lt;TextField /&gt;</w:t>
       </w:r>
     </w:p>
     <w:p>
@@ -401,7 +593,7 @@
       <w:pPr>
         <w:pStyle w:val="Heading1"/>
       </w:pPr>
-      <w:bookmarkStart w:id="1" w:name="_Toc229039669"/>
+      <w:bookmarkStart w:id="1" w:name="_Toc229130559"/>
       <w:r>
         <w:t>Icons:</w:t>
       </w:r>
@@ -427,33 +619,11 @@
       <w:r>
         <w:t xml:space="preserve">We can have &lt;Button </w:t>
       </w:r>
-      <w:proofErr w:type="spellStart"/>
       <w:r>
         <w:rPr>
           <w:color w:val="ED7D31" w:themeColor="accent2"/>
         </w:rPr>
-        <w:t>startIcon</w:t>
-      </w:r>
-      <w:proofErr w:type="spellEnd"/>
-      <w:r>
-        <w:rPr>
-          <w:color w:val="ED7D31" w:themeColor="accent2"/>
-        </w:rPr>
-        <w:t>={&lt;</w:t>
-      </w:r>
-      <w:proofErr w:type="spellStart"/>
-      <w:r>
-        <w:rPr>
-          <w:color w:val="ED7D31" w:themeColor="accent2"/>
-        </w:rPr>
-        <w:t>SomeIcon</w:t>
-      </w:r>
-      <w:proofErr w:type="spellEnd"/>
-      <w:r>
-        <w:rPr>
-          <w:color w:val="ED7D31" w:themeColor="accent2"/>
-        </w:rPr>
-        <w:t>/&gt;</w:t>
+        <w:t>startIcon={&lt;SomeIcon/&gt;</w:t>
       </w:r>
       <w:r>
         <w:t>}&gt; &lt;/Button&gt;</w:t>
@@ -465,22 +635,9 @@
       <w:pPr>
         <w:pStyle w:val="Heading1"/>
       </w:pPr>
-      <w:bookmarkStart w:id="2" w:name="_Toc229039670"/>
-      <w:r>
-        <w:t xml:space="preserve">Customizing with </w:t>
-      </w:r>
-      <w:proofErr w:type="spellStart"/>
-      <w:r>
-        <w:t>sx</w:t>
-      </w:r>
-      <w:proofErr w:type="spellEnd"/>
-      <w:proofErr w:type="gramStart"/>
-      <w:r>
-        <w:t>={</w:t>
-      </w:r>
-      <w:proofErr w:type="gramEnd"/>
-      <w:r>
-        <w:t>{}}</w:t>
+      <w:bookmarkStart w:id="2" w:name="_Toc229130560"/>
+      <w:r>
+        <w:t>Customizing with sx={{}}</w:t>
       </w:r>
       <w:bookmarkEnd w:id="2"/>
     </w:p>
@@ -505,25 +662,7 @@
         </w:numPr>
       </w:pPr>
       <w:r>
-        <w:t xml:space="preserve">We can define </w:t>
-      </w:r>
-      <w:proofErr w:type="gramStart"/>
-      <w:r>
-        <w:t>“:hover”:{</w:t>
-      </w:r>
-      <w:proofErr w:type="spellStart"/>
-      <w:proofErr w:type="gramEnd"/>
-      <w:r>
-        <w:t>color</w:t>
-      </w:r>
-      <w:proofErr w:type="spellEnd"/>
-      <w:proofErr w:type="gramStart"/>
-      <w:r>
-        <w:t>:”red</w:t>
-      </w:r>
-      <w:proofErr w:type="gramEnd"/>
-      <w:r>
-        <w:t>”}</w:t>
+        <w:t>We can define “:hover”:{color:”red”}</w:t>
       </w:r>
     </w:p>
     <w:p>
@@ -551,47 +690,8 @@
       <w:pPr>
         <w:ind w:left="720"/>
       </w:pPr>
-      <w:proofErr w:type="spellStart"/>
-      <w:r>
-        <w:t>sx</w:t>
-      </w:r>
-      <w:proofErr w:type="spellEnd"/>
-      <w:r>
-        <w:t xml:space="preserve"> </w:t>
-      </w:r>
-      <w:proofErr w:type="gramStart"/>
-      <w:r>
-        <w:t>={{ “&amp; .</w:t>
-      </w:r>
-      <w:proofErr w:type="spellStart"/>
-      <w:r>
-        <w:t>MuiSlider</w:t>
-      </w:r>
-      <w:proofErr w:type="spellEnd"/>
-      <w:proofErr w:type="gramEnd"/>
-      <w:r>
-        <w:t>-thumb</w:t>
-      </w:r>
-      <w:proofErr w:type="gramStart"/>
-      <w:r>
-        <w:t>” :</w:t>
-      </w:r>
-      <w:proofErr w:type="gramEnd"/>
-      <w:r>
-        <w:t xml:space="preserve"> </w:t>
-      </w:r>
-      <w:proofErr w:type="gramStart"/>
-      <w:r>
-        <w:t xml:space="preserve">{ </w:t>
-      </w:r>
-      <w:proofErr w:type="spellStart"/>
-      <w:r>
-        <w:t>color</w:t>
-      </w:r>
-      <w:proofErr w:type="spellEnd"/>
-      <w:proofErr w:type="gramEnd"/>
-      <w:r>
-        <w:t>: “blue”}}}</w:t>
+      <w:r>
+        <w:t>sx ={{ “&amp; .MuiSlider-thumb” : { color: “blue”}}}</w:t>
       </w:r>
     </w:p>
     <w:p>
@@ -612,27 +712,7 @@
         <w:t>referring</w:t>
       </w:r>
       <w:r>
-        <w:t xml:space="preserve"> </w:t>
-      </w:r>
-      <w:proofErr w:type="spellStart"/>
-      <w:proofErr w:type="gramStart"/>
-      <w:r>
-        <w:t>it’s</w:t>
-      </w:r>
-      <w:proofErr w:type="spellEnd"/>
-      <w:proofErr w:type="gramEnd"/>
-      <w:r>
-        <w:t xml:space="preserve"> parent means whichever the component we are writing </w:t>
-      </w:r>
-      <w:proofErr w:type="spellStart"/>
-      <w:proofErr w:type="gramStart"/>
-      <w:r>
-        <w:t>it’s</w:t>
-      </w:r>
-      <w:proofErr w:type="spellEnd"/>
-      <w:proofErr w:type="gramEnd"/>
-      <w:r>
-        <w:t xml:space="preserve"> Parent </w:t>
+        <w:t xml:space="preserve"> it’s parent means whichever the component we are writing it’s Parent </w:t>
       </w:r>
     </w:p>
     <w:p>
@@ -657,42 +737,11 @@
       <w:pPr>
         <w:ind w:left="720"/>
       </w:pPr>
-      <w:proofErr w:type="gramStart"/>
-      <w:r>
-        <w:t>.</w:t>
-      </w:r>
-      <w:proofErr w:type="spellStart"/>
-      <w:r>
-        <w:t>MuiSlider</w:t>
-      </w:r>
-      <w:proofErr w:type="spellEnd"/>
-      <w:proofErr w:type="gramEnd"/>
-      <w:r>
-        <w:t>-</w:t>
-      </w:r>
-      <w:proofErr w:type="gramStart"/>
-      <w:r>
-        <w:t>root .</w:t>
-      </w:r>
-      <w:proofErr w:type="spellStart"/>
-      <w:r>
-        <w:t>MuiSlider</w:t>
-      </w:r>
-      <w:proofErr w:type="spellEnd"/>
-      <w:proofErr w:type="gramEnd"/>
-      <w:r>
-        <w:t>-</w:t>
-      </w:r>
-      <w:proofErr w:type="gramStart"/>
-      <w:r>
-        <w:t>thumb</w:t>
-      </w:r>
-      <w:r>
-        <w:t xml:space="preserve"> :</w:t>
-      </w:r>
-      <w:proofErr w:type="gramEnd"/>
-      <w:r>
-        <w:t xml:space="preserve"> {}</w:t>
+      <w:r>
+        <w:t>.MuiSlider-root .MuiSlider-thumb</w:t>
+      </w:r>
+      <w:r>
+        <w:t xml:space="preserve"> : {}</w:t>
       </w:r>
     </w:p>
     <w:p>
@@ -704,26 +753,8 @@
       <w:pPr>
         <w:ind w:left="720"/>
       </w:pPr>
-      <w:proofErr w:type="gramStart"/>
-      <w:r>
-        <w:t>So</w:t>
-      </w:r>
-      <w:proofErr w:type="gramEnd"/>
-      <w:r>
-        <w:t xml:space="preserve"> in here we are </w:t>
-      </w:r>
-      <w:proofErr w:type="gramStart"/>
-      <w:r>
-        <w:t>referring .</w:t>
-      </w:r>
-      <w:proofErr w:type="spellStart"/>
-      <w:r>
-        <w:t>MuiSlider</w:t>
-      </w:r>
-      <w:proofErr w:type="spellEnd"/>
-      <w:proofErr w:type="gramEnd"/>
-      <w:r>
-        <w:t>-root by “&amp;”</w:t>
+      <w:r>
+        <w:t>So in here we are referring .MuiSlider-root by “&amp;”</w:t>
       </w:r>
     </w:p>
     <w:p>
@@ -738,15 +769,7 @@
     </w:p>
     <w:p>
       <w:r>
-        <w:t xml:space="preserve">- We know some states are there like </w:t>
-      </w:r>
-      <w:proofErr w:type="gramStart"/>
-      <w:r>
-        <w:t>“:hover</w:t>
-      </w:r>
-      <w:proofErr w:type="gramEnd"/>
-      <w:r>
-        <w:t>” and other that browser know</w:t>
+        <w:t>- We know some states are there like “:hover” and other that browser know</w:t>
       </w:r>
     </w:p>
     <w:p>
@@ -782,9 +805,11 @@
       <w:pPr>
         <w:pStyle w:val="Heading1"/>
       </w:pPr>
+      <w:bookmarkStart w:id="3" w:name="_Toc229130561"/>
       <w:r>
         <w:t>Creating Reusable Styled Components</w:t>
       </w:r>
+      <w:bookmarkEnd w:id="3"/>
     </w:p>
     <w:p/>
     <w:p>
@@ -792,21 +817,7 @@
         <w:rPr>
           <w:lang w:val="en-US"/>
         </w:rPr>
-        <w:t xml:space="preserve">We can use </w:t>
-      </w:r>
-      <w:proofErr w:type="gramStart"/>
-      <w:r>
-        <w:rPr>
-          <w:lang w:val="en-US"/>
-        </w:rPr>
-        <w:t>styled(</w:t>
-      </w:r>
-      <w:proofErr w:type="gramEnd"/>
-      <w:r>
-        <w:rPr>
-          <w:lang w:val="en-US"/>
-        </w:rPr>
-        <w:t xml:space="preserve">) </w:t>
+        <w:t xml:space="preserve">We can use styled() </w:t>
       </w:r>
       <w:r>
         <w:t>u</w:t>
@@ -841,35 +852,40 @@
               <w:rPr>
                 <w:lang w:val="en-US"/>
               </w:rPr>
-              <w:t xml:space="preserve">import </w:t>
-            </w:r>
-            <w:proofErr w:type="gramStart"/>
-            <w:r>
+              <w:t>import { styled } from '@mui/system';</w:t>
+            </w:r>
+          </w:p>
+          <w:p>
+            <w:pPr>
               <w:rPr>
                 <w:lang w:val="en-US"/>
               </w:rPr>
-              <w:t>{ styled</w:t>
-            </w:r>
-            <w:proofErr w:type="gramEnd"/>
-            <w:r>
+            </w:pPr>
+          </w:p>
+          <w:p>
+            <w:pPr>
               <w:rPr>
                 <w:lang w:val="en-US"/>
               </w:rPr>
-              <w:t xml:space="preserve"> } from '@</w:t>
-            </w:r>
-            <w:proofErr w:type="spellStart"/>
+            </w:pPr>
             <w:r>
               <w:rPr>
                 <w:lang w:val="en-US"/>
               </w:rPr>
-              <w:t>mui</w:t>
-            </w:r>
-            <w:proofErr w:type="spellEnd"/>
-            <w:r>
+              <w:t>const MyComponent = styled('div')({</w:t>
+            </w:r>
+          </w:p>
+          <w:p>
+            <w:pPr>
               <w:rPr>
                 <w:lang w:val="en-US"/>
               </w:rPr>
-              <w:t>/system';</w:t>
+            </w:pPr>
+            <w:r>
+              <w:rPr>
+                <w:lang w:val="en-US"/>
+              </w:rPr>
+              <w:t xml:space="preserve">  color: 'darkslategray',</w:t>
             </w:r>
           </w:p>
           <w:p>
@@ -878,6 +894,12 @@
                 <w:lang w:val="en-US"/>
               </w:rPr>
             </w:pPr>
+            <w:r>
+              <w:rPr>
+                <w:lang w:val="en-US"/>
+              </w:rPr>
+              <w:t xml:space="preserve">  backgroundColor: 'aliceblue',</w:t>
+            </w:r>
           </w:p>
           <w:p>
             <w:pPr>
@@ -889,35 +911,33 @@
               <w:rPr>
                 <w:lang w:val="en-US"/>
               </w:rPr>
-              <w:t xml:space="preserve">const </w:t>
-            </w:r>
-            <w:proofErr w:type="spellStart"/>
-            <w:r>
+              <w:t xml:space="preserve">  padding: 8, // will be converted to `8px`</w:t>
+            </w:r>
+          </w:p>
+          <w:p>
+            <w:pPr>
               <w:rPr>
                 <w:lang w:val="en-US"/>
               </w:rPr>
-              <w:t>MyComponent</w:t>
-            </w:r>
-            <w:proofErr w:type="spellEnd"/>
+            </w:pPr>
             <w:r>
               <w:rPr>
                 <w:lang w:val="en-US"/>
               </w:rPr>
-              <w:t xml:space="preserve"> = styled('div</w:t>
-            </w:r>
-            <w:proofErr w:type="gramStart"/>
-            <w:r>
+              <w:t xml:space="preserve">  borderRadius: 4, // will be converted to `4px`</w:t>
+            </w:r>
+          </w:p>
+          <w:p>
+            <w:pPr>
               <w:rPr>
                 <w:lang w:val="en-US"/>
               </w:rPr>
-              <w:t>')(</w:t>
-            </w:r>
-            <w:proofErr w:type="gramEnd"/>
+            </w:pPr>
             <w:r>
               <w:rPr>
                 <w:lang w:val="en-US"/>
               </w:rPr>
-              <w:t>{</w:t>
+              <w:t>});</w:t>
             </w:r>
           </w:p>
           <w:p>
@@ -926,202 +946,31 @@
                 <w:lang w:val="en-US"/>
               </w:rPr>
             </w:pPr>
-            <w:r>
+          </w:p>
+          <w:p>
+            <w:pPr>
               <w:rPr>
                 <w:lang w:val="en-US"/>
               </w:rPr>
-              <w:t xml:space="preserve">  color: '</w:t>
-            </w:r>
-            <w:proofErr w:type="spellStart"/>
+            </w:pPr>
             <w:r>
               <w:rPr>
                 <w:lang w:val="en-US"/>
               </w:rPr>
-              <w:t>darkslategray</w:t>
-            </w:r>
-            <w:proofErr w:type="spellEnd"/>
-            <w:r>
+              <w:t>export default function BasicUsage() {</w:t>
+            </w:r>
+          </w:p>
+          <w:p>
+            <w:pPr>
               <w:rPr>
                 <w:lang w:val="en-US"/>
               </w:rPr>
-              <w:t>',</w:t>
-            </w:r>
-          </w:p>
-          <w:p>
-            <w:pPr>
+            </w:pPr>
+            <w:r>
               <w:rPr>
                 <w:lang w:val="en-US"/>
               </w:rPr>
-            </w:pPr>
-            <w:r>
-              <w:rPr>
-                <w:lang w:val="en-US"/>
-              </w:rPr>
-              <w:t xml:space="preserve">  </w:t>
-            </w:r>
-            <w:proofErr w:type="spellStart"/>
-            <w:r>
-              <w:rPr>
-                <w:lang w:val="en-US"/>
-              </w:rPr>
-              <w:t>backgroundColor</w:t>
-            </w:r>
-            <w:proofErr w:type="spellEnd"/>
-            <w:r>
-              <w:rPr>
-                <w:lang w:val="en-US"/>
-              </w:rPr>
-              <w:t>: '</w:t>
-            </w:r>
-            <w:proofErr w:type="spellStart"/>
-            <w:r>
-              <w:rPr>
-                <w:lang w:val="en-US"/>
-              </w:rPr>
-              <w:t>aliceblue</w:t>
-            </w:r>
-            <w:proofErr w:type="spellEnd"/>
-            <w:r>
-              <w:rPr>
-                <w:lang w:val="en-US"/>
-              </w:rPr>
-              <w:t>',</w:t>
-            </w:r>
-          </w:p>
-          <w:p>
-            <w:pPr>
-              <w:rPr>
-                <w:lang w:val="en-US"/>
-              </w:rPr>
-            </w:pPr>
-            <w:r>
-              <w:rPr>
-                <w:lang w:val="en-US"/>
-              </w:rPr>
-              <w:t xml:space="preserve">  padding: 8, // will be converted to `8px`</w:t>
-            </w:r>
-          </w:p>
-          <w:p>
-            <w:pPr>
-              <w:rPr>
-                <w:lang w:val="en-US"/>
-              </w:rPr>
-            </w:pPr>
-            <w:r>
-              <w:rPr>
-                <w:lang w:val="en-US"/>
-              </w:rPr>
-              <w:t xml:space="preserve">  </w:t>
-            </w:r>
-            <w:proofErr w:type="spellStart"/>
-            <w:r>
-              <w:rPr>
-                <w:lang w:val="en-US"/>
-              </w:rPr>
-              <w:t>borderRadius</w:t>
-            </w:r>
-            <w:proofErr w:type="spellEnd"/>
-            <w:r>
-              <w:rPr>
-                <w:lang w:val="en-US"/>
-              </w:rPr>
-              <w:t>: 4, // will be converted to `4px`</w:t>
-            </w:r>
-          </w:p>
-          <w:p>
-            <w:pPr>
-              <w:rPr>
-                <w:lang w:val="en-US"/>
-              </w:rPr>
-            </w:pPr>
-            <w:r>
-              <w:rPr>
-                <w:lang w:val="en-US"/>
-              </w:rPr>
-              <w:t>});</w:t>
-            </w:r>
-          </w:p>
-          <w:p>
-            <w:pPr>
-              <w:rPr>
-                <w:lang w:val="en-US"/>
-              </w:rPr>
-            </w:pPr>
-          </w:p>
-          <w:p>
-            <w:pPr>
-              <w:rPr>
-                <w:lang w:val="en-US"/>
-              </w:rPr>
-            </w:pPr>
-            <w:r>
-              <w:rPr>
-                <w:lang w:val="en-US"/>
-              </w:rPr>
-              <w:t xml:space="preserve">export default function </w:t>
-            </w:r>
-            <w:proofErr w:type="spellStart"/>
-            <w:proofErr w:type="gramStart"/>
-            <w:r>
-              <w:rPr>
-                <w:lang w:val="en-US"/>
-              </w:rPr>
-              <w:t>BasicUsage</w:t>
-            </w:r>
-            <w:proofErr w:type="spellEnd"/>
-            <w:r>
-              <w:rPr>
-                <w:lang w:val="en-US"/>
-              </w:rPr>
-              <w:t>(</w:t>
-            </w:r>
-            <w:proofErr w:type="gramEnd"/>
-            <w:r>
-              <w:rPr>
-                <w:lang w:val="en-US"/>
-              </w:rPr>
-              <w:t>) {</w:t>
-            </w:r>
-          </w:p>
-          <w:p>
-            <w:pPr>
-              <w:rPr>
-                <w:lang w:val="en-US"/>
-              </w:rPr>
-            </w:pPr>
-            <w:r>
-              <w:rPr>
-                <w:lang w:val="en-US"/>
-              </w:rPr>
-              <w:t xml:space="preserve">  return &lt;</w:t>
-            </w:r>
-            <w:proofErr w:type="spellStart"/>
-            <w:r>
-              <w:rPr>
-                <w:lang w:val="en-US"/>
-              </w:rPr>
-              <w:t>MyComponent</w:t>
-            </w:r>
-            <w:proofErr w:type="spellEnd"/>
-            <w:r>
-              <w:rPr>
-                <w:lang w:val="en-US"/>
-              </w:rPr>
-              <w:t>&gt;Styled div&lt;/</w:t>
-            </w:r>
-            <w:proofErr w:type="spellStart"/>
-            <w:r>
-              <w:rPr>
-                <w:lang w:val="en-US"/>
-              </w:rPr>
-              <w:t>MyComponent</w:t>
-            </w:r>
-            <w:proofErr w:type="spellEnd"/>
-            <w:r>
-              <w:rPr>
-                <w:lang w:val="en-US"/>
-              </w:rPr>
-              <w:t>&gt;;</w:t>
+              <w:t xml:space="preserve">  return &lt;MyComponent&gt;Styled div&lt;/MyComponent&gt;;</w:t>
             </w:r>
           </w:p>
           <w:p>
@@ -1147,10 +996,12 @@
       <w:pPr>
         <w:pStyle w:val="Heading1"/>
       </w:pPr>
+      <w:bookmarkStart w:id="4" w:name="_Toc229130562"/>
       <w:r>
         <w:lastRenderedPageBreak/>
         <w:t>Overriding Global Theme</w:t>
       </w:r>
+      <w:bookmarkEnd w:id="4"/>
     </w:p>
     <w:p/>
     <w:p>
@@ -1175,49 +1026,18 @@
             <w:shd w:val="clear" w:color="auto" w:fill="BFBFBF" w:themeFill="background1" w:themeFillShade="BF"/>
           </w:tcPr>
           <w:p>
-            <w:proofErr w:type="spellStart"/>
-            <w:r>
-              <w:t>const</w:t>
-            </w:r>
-            <w:proofErr w:type="spellEnd"/>
-            <w:r>
-              <w:t xml:space="preserve"> theme = </w:t>
-            </w:r>
-            <w:proofErr w:type="spellStart"/>
-            <w:proofErr w:type="gramStart"/>
-            <w:r>
-              <w:t>createTheme</w:t>
-            </w:r>
-            <w:proofErr w:type="spellEnd"/>
-            <w:r>
-              <w:t>(</w:t>
-            </w:r>
-            <w:proofErr w:type="gramEnd"/>
-            <w:r>
-              <w:t>{</w:t>
-            </w:r>
-          </w:p>
-          <w:p>
-            <w:r>
-              <w:t xml:space="preserve">    </w:t>
-            </w:r>
-            <w:proofErr w:type="gramStart"/>
-            <w:r>
-              <w:t>typography:{</w:t>
-            </w:r>
-            <w:proofErr w:type="gramEnd"/>
-          </w:p>
-          <w:p>
-            <w:r>
-              <w:t xml:space="preserve">        // </w:t>
-            </w:r>
-            <w:proofErr w:type="spellStart"/>
-            <w:r>
-              <w:t>fontFamily</w:t>
-            </w:r>
-            <w:proofErr w:type="spellEnd"/>
-            <w:r>
-              <w:t>:"-apple-system"</w:t>
+            <w:r>
+              <w:t>const theme = createTheme({</w:t>
+            </w:r>
+          </w:p>
+          <w:p>
+            <w:r>
+              <w:t>    typography:{</w:t>
+            </w:r>
+          </w:p>
+          <w:p>
+            <w:r>
+              <w:t>        // fontFamily:"-apple-system"</w:t>
             </w:r>
           </w:p>
           <w:p>
@@ -1228,68 +1048,27 @@
           <w:p/>
           <w:p>
             <w:r>
-              <w:t xml:space="preserve">    </w:t>
-            </w:r>
-            <w:proofErr w:type="gramStart"/>
-            <w:r>
-              <w:t>components:{</w:t>
-            </w:r>
-            <w:proofErr w:type="gramEnd"/>
-          </w:p>
-          <w:p>
-            <w:r>
-              <w:t xml:space="preserve">        </w:t>
-            </w:r>
-            <w:proofErr w:type="spellStart"/>
-            <w:proofErr w:type="gramStart"/>
-            <w:r>
-              <w:t>MuiButton</w:t>
-            </w:r>
-            <w:proofErr w:type="spellEnd"/>
-            <w:r>
-              <w:t>:{</w:t>
-            </w:r>
-            <w:proofErr w:type="gramEnd"/>
-          </w:p>
-          <w:p>
-            <w:r>
-              <w:t xml:space="preserve">            </w:t>
-            </w:r>
-            <w:proofErr w:type="spellStart"/>
-            <w:proofErr w:type="gramStart"/>
-            <w:r>
-              <w:t>defaultProps</w:t>
-            </w:r>
-            <w:proofErr w:type="spellEnd"/>
-            <w:r>
-              <w:t>:{</w:t>
-            </w:r>
-            <w:proofErr w:type="gramEnd"/>
-          </w:p>
-          <w:p>
-            <w:r>
-              <w:t xml:space="preserve">                // </w:t>
-            </w:r>
-            <w:proofErr w:type="spellStart"/>
-            <w:r>
-              <w:t>disableRipple</w:t>
-            </w:r>
-            <w:proofErr w:type="spellEnd"/>
-            <w:r>
-              <w:t>: true,</w:t>
-            </w:r>
-          </w:p>
-          <w:p>
-            <w:r>
-              <w:t xml:space="preserve">                </w:t>
-            </w:r>
-            <w:proofErr w:type="spellStart"/>
-            <w:r>
-              <w:t>variant:"contained</w:t>
-            </w:r>
-            <w:proofErr w:type="spellEnd"/>
-            <w:r>
-              <w:t>"</w:t>
+              <w:t>    components:{</w:t>
+            </w:r>
+          </w:p>
+          <w:p>
+            <w:r>
+              <w:t>        MuiButton:{</w:t>
+            </w:r>
+          </w:p>
+          <w:p>
+            <w:r>
+              <w:t>            defaultProps:{</w:t>
+            </w:r>
+          </w:p>
+          <w:p>
+            <w:r>
+              <w:t>                // disableRipple: true,</w:t>
+            </w:r>
+          </w:p>
+          <w:p>
+            <w:r>
+              <w:t>                variant:"contained"</w:t>
             </w:r>
           </w:p>
           <w:p>
@@ -1339,28 +1118,12 @@
           </w:tcPr>
           <w:p>
             <w:r>
-              <w:t>    &lt;</w:t>
-            </w:r>
-            <w:proofErr w:type="spellStart"/>
-            <w:r>
-              <w:t>ThemeProvider</w:t>
-            </w:r>
-            <w:proofErr w:type="spellEnd"/>
-            <w:r>
-              <w:t xml:space="preserve"> theme={theme}&gt;</w:t>
-            </w:r>
-          </w:p>
-          <w:p>
-            <w:r>
-              <w:t>    &lt;/</w:t>
-            </w:r>
-            <w:proofErr w:type="spellStart"/>
-            <w:r>
-              <w:t>ThemeProvider</w:t>
-            </w:r>
-            <w:proofErr w:type="spellEnd"/>
-            <w:r>
-              <w:t>&gt;</w:t>
+              <w:t>    &lt;ThemeProvider theme={theme}&gt;</w:t>
+            </w:r>
+          </w:p>
+          <w:p>
+            <w:r>
+              <w:t>    &lt;/ThemeProvider&gt;</w:t>
             </w:r>
           </w:p>
         </w:tc>
@@ -1377,15 +1140,7 @@
     </w:p>
     <w:p>
       <w:r>
-        <w:t xml:space="preserve">e.g. theme2 then we need to pass theme2 as the prop to </w:t>
-      </w:r>
-      <w:proofErr w:type="spellStart"/>
-      <w:r>
-        <w:t>ThemeProvider</w:t>
-      </w:r>
-      <w:proofErr w:type="spellEnd"/>
-      <w:r>
-        <w:t>.</w:t>
+        <w:t>e.g. theme2 then we need to pass theme2 as the prop to ThemeProvider.</w:t>
       </w:r>
     </w:p>
     <w:p/>
@@ -1395,9 +1150,11 @@
       <w:pPr>
         <w:pStyle w:val="Heading1"/>
       </w:pPr>
+      <w:bookmarkStart w:id="5" w:name="_Toc229130563"/>
       <w:r>
         <w:t>Light and Dark Mode</w:t>
       </w:r>
+      <w:bookmarkEnd w:id="5"/>
     </w:p>
     <w:p/>
     <w:tbl>
@@ -1417,80 +1174,17 @@
           </w:tcPr>
           <w:p>
             <w:r>
-              <w:t xml:space="preserve">function </w:t>
-            </w:r>
-            <w:proofErr w:type="spellStart"/>
-            <w:proofErr w:type="gramStart"/>
-            <w:r>
-              <w:t>ThemeChanger</w:t>
-            </w:r>
-            <w:proofErr w:type="spellEnd"/>
-            <w:r>
-              <w:t>(</w:t>
-            </w:r>
-            <w:proofErr w:type="gramEnd"/>
-            <w:r>
-              <w:t>) {</w:t>
-            </w:r>
-          </w:p>
-          <w:p>
-            <w:r>
-              <w:t xml:space="preserve">  </w:t>
-            </w:r>
-            <w:proofErr w:type="spellStart"/>
-            <w:r>
-              <w:t>const</w:t>
-            </w:r>
-            <w:proofErr w:type="spellEnd"/>
-            <w:r>
-              <w:t xml:space="preserve"> </w:t>
-            </w:r>
-            <w:proofErr w:type="gramStart"/>
-            <w:r>
-              <w:t>{ mode</w:t>
-            </w:r>
-            <w:proofErr w:type="gramEnd"/>
-            <w:r>
-              <w:t xml:space="preserve">, </w:t>
-            </w:r>
-            <w:proofErr w:type="spellStart"/>
-            <w:proofErr w:type="gramStart"/>
-            <w:r>
-              <w:t>setMode</w:t>
-            </w:r>
-            <w:proofErr w:type="spellEnd"/>
-            <w:r>
-              <w:t xml:space="preserve"> }</w:t>
-            </w:r>
-            <w:proofErr w:type="gramEnd"/>
-            <w:r>
-              <w:t xml:space="preserve"> = </w:t>
-            </w:r>
-            <w:proofErr w:type="spellStart"/>
-            <w:proofErr w:type="gramStart"/>
-            <w:r>
-              <w:t>useColorScheme</w:t>
-            </w:r>
-            <w:proofErr w:type="spellEnd"/>
-            <w:r>
-              <w:t>(</w:t>
-            </w:r>
-            <w:proofErr w:type="gramEnd"/>
-            <w:r>
-              <w:t>);</w:t>
-            </w:r>
-          </w:p>
-          <w:p>
-            <w:r>
-              <w:t>  if</w:t>
-            </w:r>
-            <w:proofErr w:type="gramStart"/>
-            <w:r>
-              <w:t>(!mode</w:t>
-            </w:r>
-            <w:proofErr w:type="gramEnd"/>
-            <w:r>
-              <w:t>) return null;</w:t>
+              <w:t>function ThemeChanger() {</w:t>
+            </w:r>
+          </w:p>
+          <w:p>
+            <w:r>
+              <w:t>  const { mode, setMode } = useColorScheme();</w:t>
+            </w:r>
+          </w:p>
+          <w:p>
+            <w:r>
+              <w:t>  if(!mode) return null;</w:t>
             </w:r>
           </w:p>
           <w:p/>
@@ -1501,13 +1195,8 @@
           </w:p>
           <w:p>
             <w:r>
-              <w:t>    &lt;</w:t>
-            </w:r>
-            <w:proofErr w:type="spellStart"/>
-            <w:r>
-              <w:t>RadioGroup</w:t>
-            </w:r>
-            <w:proofErr w:type="spellEnd"/>
+              <w:t>    &lt;RadioGroup</w:t>
+            </w:r>
           </w:p>
           <w:p>
             <w:r>
@@ -1516,36 +1205,7 @@
           </w:p>
           <w:p>
             <w:r>
-              <w:t xml:space="preserve">      </w:t>
-            </w:r>
-            <w:proofErr w:type="spellStart"/>
-            <w:r>
-              <w:t>onChange</w:t>
-            </w:r>
-            <w:proofErr w:type="spellEnd"/>
-            <w:r>
-              <w:t xml:space="preserve">={(e) =&gt; </w:t>
-            </w:r>
-            <w:proofErr w:type="spellStart"/>
-            <w:proofErr w:type="gramStart"/>
-            <w:r>
-              <w:t>setMode</w:t>
-            </w:r>
-            <w:proofErr w:type="spellEnd"/>
-            <w:r>
-              <w:t>(</w:t>
-            </w:r>
-            <w:proofErr w:type="spellStart"/>
-            <w:r>
-              <w:t>e.target</w:t>
-            </w:r>
-            <w:proofErr w:type="gramEnd"/>
-            <w:r>
-              <w:t>.value</w:t>
-            </w:r>
-            <w:proofErr w:type="spellEnd"/>
-            <w:r>
-              <w:t xml:space="preserve"> as "light" | "dark" | "system")}</w:t>
+              <w:t>      onChange={(e) =&gt; setMode(e.target.value as "light" | "dark" | "system")}</w:t>
             </w:r>
           </w:p>
           <w:p>
@@ -1556,78 +1216,22 @@
           <w:p>
             <w:r>
               <w:lastRenderedPageBreak/>
-              <w:t>      &lt;</w:t>
-            </w:r>
-            <w:proofErr w:type="spellStart"/>
-            <w:r>
-              <w:t>FormControlLabel</w:t>
-            </w:r>
-            <w:proofErr w:type="spellEnd"/>
-            <w:r>
-              <w:t xml:space="preserve"> control</w:t>
-            </w:r>
-            <w:proofErr w:type="gramStart"/>
-            <w:r>
-              <w:t>={</w:t>
-            </w:r>
-            <w:proofErr w:type="gramEnd"/>
-            <w:r>
-              <w:t>&lt;Radio /&gt;} value={"system"} label="System" /&gt;</w:t>
-            </w:r>
-          </w:p>
-          <w:p>
-            <w:r>
-              <w:t>      &lt;</w:t>
-            </w:r>
-            <w:proofErr w:type="spellStart"/>
-            <w:r>
-              <w:t>FormControlLabel</w:t>
-            </w:r>
-            <w:proofErr w:type="spellEnd"/>
-            <w:r>
-              <w:t xml:space="preserve"> control</w:t>
-            </w:r>
-            <w:proofErr w:type="gramStart"/>
-            <w:r>
-              <w:t>={</w:t>
-            </w:r>
-            <w:proofErr w:type="gramEnd"/>
-            <w:r>
-              <w:t>&lt;Radio /&gt;} value={"light"} label="Light" /&gt;</w:t>
-            </w:r>
-          </w:p>
-          <w:p>
-            <w:r>
-              <w:t>      &lt;</w:t>
-            </w:r>
-            <w:proofErr w:type="spellStart"/>
-            <w:r>
-              <w:t>FormControlLabel</w:t>
-            </w:r>
-            <w:proofErr w:type="spellEnd"/>
-            <w:r>
-              <w:t xml:space="preserve"> control</w:t>
-            </w:r>
-            <w:proofErr w:type="gramStart"/>
-            <w:r>
-              <w:t>={</w:t>
-            </w:r>
-            <w:proofErr w:type="gramEnd"/>
-            <w:r>
-              <w:t>&lt;Radio /&gt;} value={"dark"} label="Dark" /&gt;</w:t>
-            </w:r>
-          </w:p>
-          <w:p>
-            <w:r>
-              <w:t>    &lt;/</w:t>
-            </w:r>
-            <w:proofErr w:type="spellStart"/>
-            <w:r>
-              <w:t>RadioGroup</w:t>
-            </w:r>
-            <w:proofErr w:type="spellEnd"/>
-            <w:r>
-              <w:t>&gt;</w:t>
+              <w:t>      &lt;FormControlLabel control={&lt;Radio /&gt;} value={"system"} label="System" /&gt;</w:t>
+            </w:r>
+          </w:p>
+          <w:p>
+            <w:r>
+              <w:t>      &lt;FormControlLabel control={&lt;Radio /&gt;} value={"light"} label="Light" /&gt;</w:t>
+            </w:r>
+          </w:p>
+          <w:p>
+            <w:r>
+              <w:t>      &lt;FormControlLabel control={&lt;Radio /&gt;} value={"dark"} label="Dark" /&gt;</w:t>
+            </w:r>
+          </w:p>
+          <w:p>
+            <w:r>
+              <w:t>    &lt;/RadioGroup&gt;</w:t>
             </w:r>
           </w:p>
           <w:p>
@@ -1648,20 +1252,7 @@
     <w:p/>
     <w:p>
       <w:r>
-        <w:t xml:space="preserve">MUI provides a hook </w:t>
-      </w:r>
-      <w:proofErr w:type="spellStart"/>
-      <w:proofErr w:type="gramStart"/>
-      <w:r>
-        <w:t>useColorScheme</w:t>
-      </w:r>
-      <w:proofErr w:type="spellEnd"/>
-      <w:r>
-        <w:t>(</w:t>
-      </w:r>
-      <w:proofErr w:type="gramEnd"/>
-      <w:r>
-        <w:t>);</w:t>
+        <w:t>MUI provides a hook useColorScheme();</w:t>
       </w:r>
     </w:p>
     <w:p/>
@@ -1674,15 +1265,7 @@
         </w:numPr>
       </w:pPr>
       <w:r>
-        <w:t xml:space="preserve">We can even change the dark and light </w:t>
-      </w:r>
-      <w:proofErr w:type="spellStart"/>
-      <w:r>
-        <w:t>color</w:t>
-      </w:r>
-      <w:proofErr w:type="spellEnd"/>
-      <w:r>
-        <w:t xml:space="preserve"> palette </w:t>
+        <w:t xml:space="preserve">We can even change the dark and light color palette </w:t>
       </w:r>
     </w:p>
     <w:tbl>
@@ -1719,7 +1302,6 @@
                 <w14:ligatures w14:val="none"/>
               </w:rPr>
             </w:pPr>
-            <w:proofErr w:type="spellStart"/>
             <w:r>
               <w:rPr>
                 <w:rFonts w:ascii="Consolas" w:eastAsia="Times New Roman" w:hAnsi="Consolas" w:cs="Times New Roman"/>
@@ -1732,7 +1314,6 @@
               </w:rPr>
               <w:t>const</w:t>
             </w:r>
-            <w:proofErr w:type="spellEnd"/>
             <w:r>
               <w:rPr>
                 <w:rFonts w:ascii="Consolas" w:eastAsia="Times New Roman" w:hAnsi="Consolas" w:cs="Times New Roman"/>
@@ -1769,8 +1350,6 @@
               </w:rPr>
               <w:t xml:space="preserve"> = </w:t>
             </w:r>
-            <w:proofErr w:type="spellStart"/>
-            <w:proofErr w:type="gramStart"/>
             <w:r>
               <w:rPr>
                 <w:rFonts w:ascii="Consolas" w:eastAsia="Times New Roman" w:hAnsi="Consolas" w:cs="Times New Roman"/>
@@ -1783,7 +1362,6 @@
               </w:rPr>
               <w:t>createTheme</w:t>
             </w:r>
-            <w:proofErr w:type="spellEnd"/>
             <w:r>
               <w:rPr>
                 <w:rFonts w:ascii="Consolas" w:eastAsia="Times New Roman" w:hAnsi="Consolas" w:cs="Times New Roman"/>
@@ -1794,20 +1372,7 @@
                 <w:lang w:eastAsia="en-IN" w:bidi="gu-IN"/>
                 <w14:ligatures w14:val="none"/>
               </w:rPr>
-              <w:t>(</w:t>
-            </w:r>
-            <w:proofErr w:type="gramEnd"/>
-            <w:r>
-              <w:rPr>
-                <w:rFonts w:ascii="Consolas" w:eastAsia="Times New Roman" w:hAnsi="Consolas" w:cs="Times New Roman"/>
-                <w:color w:val="D4D4D4"/>
-                <w:kern w:val="0"/>
-                <w:sz w:val="26"/>
-                <w:szCs w:val="26"/>
-                <w:lang w:eastAsia="en-IN" w:bidi="gu-IN"/>
-                <w14:ligatures w14:val="none"/>
-              </w:rPr>
-              <w:t>{</w:t>
+              <w:t>({</w:t>
             </w:r>
           </w:p>
           <w:p>
@@ -1841,7 +1406,6 @@
               </w:rPr>
               <w:t xml:space="preserve">  </w:t>
             </w:r>
-            <w:proofErr w:type="spellStart"/>
             <w:r>
               <w:rPr>
                 <w:rFonts w:ascii="Consolas" w:eastAsia="Times New Roman" w:hAnsi="Consolas" w:cs="Times New Roman"/>
@@ -1854,7 +1418,6 @@
               </w:rPr>
               <w:t>colorSchemes</w:t>
             </w:r>
-            <w:proofErr w:type="spellEnd"/>
             <w:r>
               <w:rPr>
                 <w:rFonts w:ascii="Consolas" w:eastAsia="Times New Roman" w:hAnsi="Consolas" w:cs="Times New Roman"/>
@@ -2306,23 +1869,76 @@
         <w:pStyle w:val="ListParagraph"/>
       </w:pPr>
       <w:r>
-        <w:t xml:space="preserve">- Note: That If we are defining </w:t>
-      </w:r>
-      <w:proofErr w:type="spellStart"/>
-      <w:r>
-        <w:t>any thing</w:t>
-      </w:r>
-      <w:proofErr w:type="spellEnd"/>
-      <w:r>
-        <w:t xml:space="preserve"> like here in </w:t>
-      </w:r>
-      <w:proofErr w:type="gramStart"/>
-      <w:r>
-        <w:t>primary:{</w:t>
-      </w:r>
-      <w:proofErr w:type="gramEnd"/>
-      <w:r>
-        <w:t>} then defining “main” is must – Other shades and weights MUI will automatically generate.</w:t>
+        <w:t>- Note: That If we are defining any thing like here in primary:{} then defining “main” is must – Other shades and weights MUI will automatically generate.</w:t>
+      </w:r>
+    </w:p>
+    <w:p/>
+    <w:p/>
+    <w:p/>
+    <w:p>
+      <w:pPr>
+        <w:pStyle w:val="Heading1"/>
+      </w:pPr>
+      <w:r>
+        <w:t>Responsiveness:</w:t>
+      </w:r>
+    </w:p>
+    <w:p/>
+    <w:p>
+      <w:r>
+        <w:t>While creating grid</w:t>
+      </w:r>
+    </w:p>
+    <w:tbl>
+      <w:tblPr>
+        <w:tblStyle w:val="TableGrid"/>
+        <w:tblW w:w="0" w:type="auto"/>
+        <w:tblLook w:val="04A0" w:firstRow="1" w:lastRow="0" w:firstColumn="1" w:lastColumn="0" w:noHBand="0" w:noVBand="1"/>
+      </w:tblPr>
+      <w:tblGrid>
+        <w:gridCol w:w="9016"/>
+      </w:tblGrid>
+      <w:tr>
+        <w:tc>
+          <w:tcPr>
+            <w:tcW w:w="9016" w:type="dxa"/>
+            <w:shd w:val="clear" w:color="auto" w:fill="E7E6E6" w:themeFill="background2"/>
+          </w:tcPr>
+          <w:p>
+            <w:r>
+              <w:t xml:space="preserve">&lt;Grid </w:t>
+            </w:r>
+            <w:r>
+              <w:rPr>
+                <w:color w:val="4472C4" w:themeColor="accent1"/>
+              </w:rPr>
+              <w:t>container</w:t>
+            </w:r>
+            <w:r>
+              <w:t>&gt;</w:t>
+            </w:r>
+          </w:p>
+          <w:p/>
+        </w:tc>
+      </w:tr>
+    </w:tbl>
+    <w:p/>
+    <w:p>
+      <w:r>
+        <w:t xml:space="preserve">Use </w:t>
+      </w:r>
+      <w:r>
+        <w:rPr>
+          <w:b/>
+          <w:bCs/>
+        </w:rPr>
+        <w:t xml:space="preserve">container </w:t>
+      </w:r>
+      <w:r>
+        <w:t xml:space="preserve">property to tell that this is parent </w:t>
+      </w:r>
+      <w:r>
+        <w:t>Grid.</w:t>
       </w:r>
     </w:p>
     <w:sectPr>

</xml_diff>